<commit_message>
Completed the documentation finally
</commit_message>
<xml_diff>
--- a/docs/documentation.docx
+++ b/docs/documentation.docx
@@ -4,428 +4,1038 @@
   <w:body>
     <w:p>
       <w:pPr>
-        <w:pStyle w:val="Title"/>
-        <w:rPr>
-          <w:lang w:val="hu-HU"/>
-        </w:rPr>
+        <w:pStyle w:val="Cm"/>
       </w:pPr>
       <w:r>
         <w:rPr>
           <w:lang w:val="en-US"/>
         </w:rPr>
-        <w:t xml:space="preserve">Modern .NET </w:t>
-      </w:r>
-      <w:proofErr w:type="spellStart"/>
-      <w:r>
-        <w:rPr>
-          <w:lang w:val="en-US"/>
-        </w:rPr>
-        <w:t>beadand</w:t>
-      </w:r>
-      <w:proofErr w:type="spellEnd"/>
-      <w:r>
-        <w:rPr>
-          <w:lang w:val="hu-HU"/>
-        </w:rPr>
+        <w:t>Modern .NET beadand</w:t>
+      </w:r>
+      <w:r>
         <w:t>ó</w:t>
       </w:r>
     </w:p>
-    <w:p>
-      <w:pPr>
-        <w:rPr>
-          <w:lang w:val="hu-HU"/>
-        </w:rPr>
-      </w:pPr>
-    </w:p>
-    <w:p>
-      <w:pPr>
-        <w:rPr>
-          <w:lang w:val="hu-HU"/>
-        </w:rPr>
-      </w:pPr>
-      <w:r>
-        <w:rPr>
-          <w:lang w:val="hu-HU"/>
-        </w:rPr>
+    <w:p/>
+    <w:p>
+      <w:r>
         <w:t>Készítette: Kmeczó András</w:t>
       </w:r>
     </w:p>
     <w:p>
-      <w:pPr>
-        <w:rPr>
-          <w:lang w:val="hu-HU"/>
-        </w:rPr>
-      </w:pPr>
-    </w:p>
-    <w:p>
-      <w:pPr>
-        <w:rPr>
-          <w:b/>
-          <w:bCs/>
-          <w:lang w:val="hu-HU"/>
-        </w:rPr>
-      </w:pPr>
-      <w:r>
-        <w:rPr>
-          <w:b/>
-          <w:bCs/>
-          <w:lang w:val="hu-HU"/>
+      <w:r>
+        <w:t>Neptun-kód: ROXFTL</w:t>
+      </w:r>
+    </w:p>
+    <w:p>
+      <w:pPr>
+        <w:rPr>
+          <w:sz w:val="32"/>
+          <w:szCs w:val="32"/>
+        </w:rPr>
+      </w:pPr>
+    </w:p>
+    <w:p>
+      <w:pPr>
+        <w:rPr>
+          <w:b/>
+          <w:bCs/>
+          <w:sz w:val="32"/>
+          <w:szCs w:val="32"/>
+        </w:rPr>
+      </w:pPr>
+      <w:r>
+        <w:rPr>
+          <w:b/>
+          <w:bCs/>
+          <w:sz w:val="32"/>
+          <w:szCs w:val="32"/>
         </w:rPr>
         <w:t>Feladatkiírás:</w:t>
       </w:r>
     </w:p>
     <w:p>
-      <w:pPr>
-        <w:rPr>
-          <w:lang w:val="hu-HU"/>
-        </w:rPr>
-      </w:pPr>
-      <w:r>
-        <w:rPr>
-          <w:lang w:val="hu-HU"/>
-        </w:rPr>
-        <w:t>A dokumentum végén található, a PDF-ből kimásolva.</w:t>
-      </w:r>
-    </w:p>
-    <w:p>
-      <w:pPr>
-        <w:rPr>
-          <w:lang w:val="hu-HU"/>
-        </w:rPr>
-      </w:pPr>
-    </w:p>
-    <w:p>
-      <w:pPr>
-        <w:rPr>
-          <w:b/>
-          <w:bCs/>
-          <w:lang w:val="hu-HU"/>
-        </w:rPr>
-      </w:pPr>
-      <w:r>
-        <w:rPr>
-          <w:b/>
-          <w:bCs/>
-          <w:lang w:val="hu-HU"/>
-        </w:rPr>
-        <w:t>Választott feladatok:</w:t>
-      </w:r>
-    </w:p>
-    <w:p>
-      <w:pPr>
-        <w:pStyle w:val="ListParagraph"/>
-        <w:numPr>
-          <w:ilvl w:val="0"/>
-          <w:numId w:val="1"/>
-        </w:numPr>
-        <w:rPr>
-          <w:lang w:val="hu-HU"/>
-        </w:rPr>
-      </w:pPr>
-      <w:r>
-        <w:rPr>
-          <w:lang w:val="hu-HU"/>
-        </w:rPr>
-        <w:t>Alapfeladat (2 pont)</w:t>
-      </w:r>
-    </w:p>
-    <w:p>
-      <w:pPr>
-        <w:pStyle w:val="ListParagraph"/>
+      <w:r>
+        <w:t>A docs mappában található voting_system.pdf fájlban található.</w:t>
+      </w:r>
+    </w:p>
+    <w:p>
+      <w:pPr>
+        <w:rPr>
+          <w:sz w:val="32"/>
+          <w:szCs w:val="32"/>
+        </w:rPr>
+      </w:pPr>
+    </w:p>
+    <w:p>
+      <w:pPr>
+        <w:rPr>
+          <w:b/>
+          <w:bCs/>
+          <w:sz w:val="32"/>
+          <w:szCs w:val="32"/>
+        </w:rPr>
+      </w:pPr>
+      <w:r>
+        <w:rPr>
+          <w:b/>
+          <w:bCs/>
+          <w:sz w:val="32"/>
+          <w:szCs w:val="32"/>
+        </w:rPr>
+        <w:t>Választott feladatok</w:t>
+      </w:r>
+      <w:r>
+        <w:rPr>
+          <w:b/>
+          <w:bCs/>
+          <w:sz w:val="32"/>
+          <w:szCs w:val="32"/>
+        </w:rPr>
+        <w:t xml:space="preserve"> (összesen 6,5 pont ~ 6 pont)</w:t>
+      </w:r>
+      <w:r>
+        <w:rPr>
+          <w:b/>
+          <w:bCs/>
+          <w:sz w:val="32"/>
+          <w:szCs w:val="32"/>
+        </w:rPr>
+        <w:t>:</w:t>
+      </w:r>
+    </w:p>
+    <w:p>
+      <w:pPr>
+        <w:pStyle w:val="Listaszerbekezds"/>
+        <w:numPr>
+          <w:ilvl w:val="0"/>
+          <w:numId w:val="1"/>
+        </w:numPr>
+      </w:pPr>
+      <w:r>
+        <w:t>Alapfeladat (</w:t>
+      </w:r>
+      <w:r>
+        <w:t>3</w:t>
+      </w:r>
+      <w:r>
+        <w:t xml:space="preserve"> pont)</w:t>
+      </w:r>
+    </w:p>
+    <w:p>
+      <w:pPr>
+        <w:pStyle w:val="Listaszerbekezds"/>
         <w:numPr>
           <w:ilvl w:val="1"/>
           <w:numId w:val="1"/>
         </w:numPr>
-        <w:rPr>
-          <w:lang w:val="hu-HU"/>
-        </w:rPr>
-      </w:pPr>
-      <w:proofErr w:type="spellStart"/>
-      <w:r>
-        <w:rPr>
-          <w:lang w:val="hu-HU"/>
-        </w:rPr>
-        <w:t>WebAPI</w:t>
-      </w:r>
-      <w:proofErr w:type="spellEnd"/>
-      <w:r>
-        <w:rPr>
-          <w:lang w:val="hu-HU"/>
-        </w:rPr>
-        <w:t xml:space="preserve"> készítés egy szavazati rendszerhez - kész</w:t>
-      </w:r>
-    </w:p>
-    <w:p>
-      <w:pPr>
-        <w:pStyle w:val="ListParagraph"/>
+      </w:pPr>
+      <w:r>
+        <w:t>WebAPI készítés egy szavazati rendszerhez</w:t>
+      </w:r>
+    </w:p>
+    <w:p>
+      <w:pPr>
+        <w:pStyle w:val="Listaszerbekezds"/>
         <w:numPr>
           <w:ilvl w:val="1"/>
           <w:numId w:val="1"/>
         </w:numPr>
-        <w:rPr>
-          <w:lang w:val="hu-HU"/>
-        </w:rPr>
-      </w:pPr>
-      <w:proofErr w:type="spellStart"/>
-      <w:r>
-        <w:rPr>
-          <w:lang w:val="hu-HU"/>
-        </w:rPr>
-        <w:t>Blazor</w:t>
-      </w:r>
-      <w:proofErr w:type="spellEnd"/>
-      <w:r>
-        <w:rPr>
-          <w:lang w:val="hu-HU"/>
-        </w:rPr>
-        <w:t xml:space="preserve"> Webalkalmazás készítése az adminisztrációs felülethez - kész</w:t>
-      </w:r>
-    </w:p>
-    <w:p>
-      <w:pPr>
-        <w:pStyle w:val="ListParagraph"/>
+      </w:pPr>
+      <w:r>
+        <w:t>Blazor Webalkalmazás készítése az adminisztrációs felülethez</w:t>
+      </w:r>
+    </w:p>
+    <w:p>
+      <w:pPr>
+        <w:pStyle w:val="Listaszerbekezds"/>
         <w:numPr>
           <w:ilvl w:val="1"/>
           <w:numId w:val="1"/>
         </w:numPr>
-        <w:rPr>
-          <w:lang w:val="hu-HU"/>
-        </w:rPr>
-      </w:pPr>
-      <w:r>
-        <w:rPr>
-          <w:lang w:val="hu-HU"/>
-        </w:rPr>
-        <w:t xml:space="preserve">Szavazói felület elkészítése szintén </w:t>
-      </w:r>
-      <w:proofErr w:type="spellStart"/>
-      <w:r>
-        <w:rPr>
-          <w:lang w:val="hu-HU"/>
-        </w:rPr>
-        <w:t>Blazorben</w:t>
-      </w:r>
-      <w:proofErr w:type="spellEnd"/>
-      <w:r>
-        <w:rPr>
-          <w:lang w:val="hu-HU"/>
-        </w:rPr>
-        <w:t xml:space="preserve"> - kész</w:t>
-      </w:r>
-    </w:p>
-    <w:p>
-      <w:pPr>
-        <w:pStyle w:val="ListParagraph"/>
+      </w:pPr>
+      <w:r>
+        <w:t>Szavazói felület elkészítése szintén Blazorben</w:t>
+      </w:r>
+    </w:p>
+    <w:p>
+      <w:pPr>
+        <w:pStyle w:val="Listaszerbekezds"/>
         <w:numPr>
           <w:ilvl w:val="1"/>
           <w:numId w:val="1"/>
         </w:numPr>
-        <w:rPr>
-          <w:lang w:val="hu-HU"/>
-        </w:rPr>
-      </w:pPr>
-      <w:r>
-        <w:rPr>
-          <w:lang w:val="hu-HU"/>
-        </w:rPr>
-        <w:t xml:space="preserve">Az alapfeladat elemeinek tesztelése (DataAccess réteg, </w:t>
-      </w:r>
-      <w:proofErr w:type="spellStart"/>
-      <w:r>
-        <w:rPr>
-          <w:lang w:val="hu-HU"/>
-        </w:rPr>
-        <w:t>Controller</w:t>
-      </w:r>
-      <w:proofErr w:type="spellEnd"/>
-      <w:r>
-        <w:rPr>
-          <w:lang w:val="hu-HU"/>
-        </w:rPr>
-        <w:t xml:space="preserve"> integrálási tesztek, </w:t>
-      </w:r>
-      <w:proofErr w:type="spellStart"/>
-      <w:r>
-        <w:rPr>
-          <w:lang w:val="hu-HU"/>
-        </w:rPr>
-        <w:t>Blazor</w:t>
-      </w:r>
-      <w:proofErr w:type="spellEnd"/>
-      <w:r>
-        <w:rPr>
-          <w:lang w:val="hu-HU"/>
-        </w:rPr>
-        <w:t xml:space="preserve"> alkalmazások tesztelése) - nincs</w:t>
-      </w:r>
-    </w:p>
-    <w:p>
-      <w:pPr>
-        <w:pStyle w:val="ListParagraph"/>
+      </w:pPr>
+      <w:r>
+        <w:t>Az alapfeladat elemeinek tesztelése (DataAccess réteg, Controller integrálási tesztek</w:t>
+      </w:r>
+      <w:r>
+        <w:t>, SignalR integrációs tesztek</w:t>
+      </w:r>
+      <w:r>
+        <w:t xml:space="preserve">, Blazor </w:t>
+      </w:r>
+      <w:r>
+        <w:t>Admin felület</w:t>
+      </w:r>
+      <w:r>
+        <w:t xml:space="preserve"> tesztelése)</w:t>
+      </w:r>
+    </w:p>
+    <w:p>
+      <w:pPr>
+        <w:pStyle w:val="Listaszerbekezds"/>
         <w:numPr>
           <w:ilvl w:val="1"/>
           <w:numId w:val="1"/>
         </w:numPr>
-        <w:rPr>
-          <w:lang w:val="hu-HU"/>
-        </w:rPr>
-      </w:pPr>
-      <w:r>
-        <w:rPr>
-          <w:lang w:val="hu-HU"/>
-        </w:rPr>
-        <w:t>Dokumentáció készítése - nincs</w:t>
-      </w:r>
-    </w:p>
-    <w:p>
-      <w:pPr>
-        <w:pStyle w:val="ListParagraph"/>
-        <w:numPr>
-          <w:ilvl w:val="0"/>
-          <w:numId w:val="1"/>
-        </w:numPr>
-        <w:rPr>
-          <w:lang w:val="hu-HU"/>
-        </w:rPr>
-      </w:pPr>
-      <w:r>
-        <w:rPr>
-          <w:lang w:val="hu-HU"/>
-        </w:rPr>
-        <w:t>Kétfaktoros hitelesítés (fél pont) - készül</w:t>
-      </w:r>
-    </w:p>
-    <w:p>
-      <w:pPr>
-        <w:pStyle w:val="ListParagraph"/>
-        <w:numPr>
-          <w:ilvl w:val="0"/>
-          <w:numId w:val="1"/>
-        </w:numPr>
-        <w:rPr>
-          <w:lang w:val="hu-HU"/>
-        </w:rPr>
-      </w:pPr>
-      <w:r>
-        <w:rPr>
-          <w:lang w:val="hu-HU"/>
-        </w:rPr>
-        <w:t>OAuth2 flow (fél pont) - kész</w:t>
-      </w:r>
-    </w:p>
-    <w:p>
-      <w:pPr>
-        <w:pStyle w:val="ListParagraph"/>
-        <w:numPr>
-          <w:ilvl w:val="0"/>
-          <w:numId w:val="1"/>
-        </w:numPr>
-        <w:rPr>
-          <w:lang w:val="hu-HU"/>
-        </w:rPr>
-      </w:pPr>
-      <w:r>
-        <w:rPr>
-          <w:lang w:val="hu-HU"/>
-        </w:rPr>
-        <w:t>Elfelejtett jelszó (fél pont) - készül</w:t>
-      </w:r>
-    </w:p>
-    <w:p>
-      <w:pPr>
-        <w:pStyle w:val="ListParagraph"/>
-        <w:numPr>
-          <w:ilvl w:val="0"/>
-          <w:numId w:val="1"/>
-        </w:numPr>
-        <w:rPr>
-          <w:lang w:val="hu-HU"/>
-        </w:rPr>
-      </w:pPr>
-      <w:r>
-        <w:rPr>
-          <w:lang w:val="hu-HU"/>
-        </w:rPr>
-        <w:t>Szerkeszthető szavazások (fél pont) - kész</w:t>
-      </w:r>
-    </w:p>
-    <w:p>
-      <w:pPr>
-        <w:pStyle w:val="ListParagraph"/>
-        <w:numPr>
-          <w:ilvl w:val="0"/>
-          <w:numId w:val="1"/>
-        </w:numPr>
-        <w:rPr>
-          <w:lang w:val="hu-HU"/>
-        </w:rPr>
-      </w:pPr>
-      <w:r>
-        <w:rPr>
-          <w:lang w:val="hu-HU"/>
-        </w:rPr>
-        <w:t>Rendszeradminisztrátori szerepkör (1 pont) - kész</w:t>
-      </w:r>
-    </w:p>
-    <w:p>
-      <w:pPr>
-        <w:pStyle w:val="ListParagraph"/>
-        <w:numPr>
-          <w:ilvl w:val="0"/>
-          <w:numId w:val="1"/>
-        </w:numPr>
-        <w:rPr>
-          <w:lang w:val="hu-HU"/>
-        </w:rPr>
-      </w:pPr>
-      <w:r>
-        <w:rPr>
-          <w:lang w:val="hu-HU"/>
-        </w:rPr>
-        <w:t xml:space="preserve">Elő eredmények (1 pont, </w:t>
-      </w:r>
-      <w:proofErr w:type="spellStart"/>
-      <w:r>
-        <w:rPr>
-          <w:lang w:val="hu-HU"/>
-        </w:rPr>
-        <w:t>SignalR</w:t>
-      </w:r>
-      <w:proofErr w:type="spellEnd"/>
-      <w:r>
-        <w:rPr>
-          <w:lang w:val="hu-HU"/>
-        </w:rPr>
-        <w:t>) – nincs</w:t>
-      </w:r>
-    </w:p>
-    <w:p>
-      <w:pPr>
-        <w:rPr>
-          <w:lang w:val="hu-HU"/>
-        </w:rPr>
-      </w:pPr>
-    </w:p>
-    <w:p>
-      <w:pPr>
-        <w:rPr>
-          <w:lang w:val="hu-HU"/>
-        </w:rPr>
-      </w:pPr>
-    </w:p>
-    <w:p>
-      <w:pPr>
-        <w:rPr>
-          <w:lang w:val="hu-HU"/>
-        </w:rPr>
-      </w:pPr>
-    </w:p>
-    <w:p>
-      <w:pPr>
-        <w:rPr>
-          <w:lang w:val="hu-HU"/>
-        </w:rPr>
-      </w:pPr>
+      </w:pPr>
+      <w:r>
+        <w:t>Dokumentáció készítése</w:t>
+      </w:r>
+    </w:p>
+    <w:p>
+      <w:pPr>
+        <w:pStyle w:val="Listaszerbekezds"/>
+        <w:numPr>
+          <w:ilvl w:val="0"/>
+          <w:numId w:val="1"/>
+        </w:numPr>
+      </w:pPr>
+      <w:r>
+        <w:t>OAuth2 flow (fél pont)</w:t>
+      </w:r>
+    </w:p>
+    <w:p>
+      <w:pPr>
+        <w:pStyle w:val="Listaszerbekezds"/>
+        <w:numPr>
+          <w:ilvl w:val="0"/>
+          <w:numId w:val="1"/>
+        </w:numPr>
+      </w:pPr>
+      <w:r>
+        <w:t xml:space="preserve">Elfelejtett jelszó (fél pont) </w:t>
+      </w:r>
+    </w:p>
+    <w:p>
+      <w:pPr>
+        <w:pStyle w:val="Listaszerbekezds"/>
+        <w:numPr>
+          <w:ilvl w:val="0"/>
+          <w:numId w:val="1"/>
+        </w:numPr>
+      </w:pPr>
+      <w:r>
+        <w:t>Szerkeszthető szavazások (fél pont)</w:t>
+      </w:r>
+    </w:p>
+    <w:p>
+      <w:pPr>
+        <w:pStyle w:val="Listaszerbekezds"/>
+        <w:numPr>
+          <w:ilvl w:val="0"/>
+          <w:numId w:val="1"/>
+        </w:numPr>
+      </w:pPr>
+      <w:r>
+        <w:t>Rendszeradminisztrátori szerepkör (1 pont)</w:t>
+      </w:r>
+    </w:p>
+    <w:p>
+      <w:pPr>
+        <w:pStyle w:val="Listaszerbekezds"/>
+        <w:numPr>
+          <w:ilvl w:val="0"/>
+          <w:numId w:val="1"/>
+        </w:numPr>
+      </w:pPr>
+      <w:r>
+        <w:t xml:space="preserve">Elő eredmények (1 pont, SignalR) </w:t>
+      </w:r>
+    </w:p>
+    <w:p>
+      <w:pPr>
+        <w:rPr>
+          <w:sz w:val="32"/>
+          <w:szCs w:val="32"/>
+        </w:rPr>
+      </w:pPr>
+    </w:p>
+    <w:p>
+      <w:pPr>
+        <w:rPr>
+          <w:b/>
+          <w:bCs/>
+          <w:sz w:val="32"/>
+          <w:szCs w:val="32"/>
+        </w:rPr>
+      </w:pPr>
+      <w:r>
+        <w:rPr>
+          <w:b/>
+          <w:bCs/>
+          <w:sz w:val="32"/>
+          <w:szCs w:val="32"/>
+        </w:rPr>
+        <w:t>Feladat funkcionális elemzése:</w:t>
+      </w:r>
+    </w:p>
+    <w:p>
+      <w:pPr>
+        <w:rPr>
+          <w:b/>
+          <w:bCs/>
+        </w:rPr>
+      </w:pPr>
+    </w:p>
+    <w:p>
+      <w:r>
+        <w:t>A feladat egy olyan szavazói rendszer elkészítése, ahol a felhasználók szavazatokat írhatnak ki, majd szavazhatnak más szavazásain. Szavazatot követően mindenkinek, illetve a szavazást kiíró felhasználónak és az Admin felhasználóknak elérhető egy kimutatás a szavazás eredményéről, mely csupán a szavazás lehetőségeire leadott voksok számát tartalmazza, megőrizve az anonimitást. A felhasználó láthatja, mely szavazaton mire szavazott, és azoknak is az eredményeit. Ezek az eredmények élőben is frissülnek, amíg tart a szavazás.</w:t>
+      </w:r>
+    </w:p>
+    <w:p/>
+    <w:p>
+      <w:r>
+        <w:t>A fő felületek:</w:t>
+      </w:r>
+    </w:p>
+    <w:p>
+      <w:pPr>
+        <w:pStyle w:val="Listaszerbekezds"/>
+        <w:numPr>
+          <w:ilvl w:val="0"/>
+          <w:numId w:val="1"/>
+        </w:numPr>
+      </w:pPr>
+      <w:r>
+        <w:t>Admin felület</w:t>
+      </w:r>
+    </w:p>
+    <w:p>
+      <w:pPr>
+        <w:pStyle w:val="Listaszerbekezds"/>
+        <w:numPr>
+          <w:ilvl w:val="0"/>
+          <w:numId w:val="1"/>
+        </w:numPr>
+      </w:pPr>
+      <w:r>
+        <w:t>Szavazói felület</w:t>
+      </w:r>
+    </w:p>
+    <w:p>
+      <w:pPr>
+        <w:pStyle w:val="Listaszerbekezds"/>
+        <w:numPr>
+          <w:ilvl w:val="0"/>
+          <w:numId w:val="1"/>
+        </w:numPr>
+      </w:pPr>
+      <w:r>
+        <w:t>Swagger felület a WebAPI teszteléséhez (nem nyilvános)</w:t>
+      </w:r>
+    </w:p>
+    <w:p/>
+    <w:p>
+      <w:pPr>
+        <w:rPr>
+          <w:b/>
+          <w:bCs/>
+        </w:rPr>
+      </w:pPr>
+      <w:r>
+        <w:t>Mindegyik felület az OAuth2 flownak megfelelően az elérési token lejárta után megpróbál a refresh token segítségével hosszabbítani a session-ön, illetve ha nem sikerül, akkor átirányít a bejelentkező oldalra.</w:t>
+      </w:r>
+      <w:r>
+        <w:br/>
+      </w:r>
+      <w:r>
+        <w:br/>
+      </w:r>
+    </w:p>
+    <w:p>
+      <w:pPr>
+        <w:rPr>
+          <w:b/>
+          <w:bCs/>
+        </w:rPr>
+      </w:pPr>
+      <w:r>
+        <w:rPr>
+          <w:b/>
+          <w:bCs/>
+        </w:rPr>
+        <w:br w:type="page"/>
+      </w:r>
+    </w:p>
+    <w:p>
+      <w:r>
+        <w:rPr>
+          <w:b/>
+          <w:bCs/>
+        </w:rPr>
+        <w:lastRenderedPageBreak/>
+        <w:t>Felhasznált technológia:</w:t>
+      </w:r>
+      <w:r>
+        <w:rPr>
+          <w:b/>
+          <w:bCs/>
+        </w:rPr>
+        <w:br/>
+      </w:r>
+      <w:r>
+        <w:br/>
+        <w:t>A fejlesztést támogató eszközök:</w:t>
+      </w:r>
+      <w:r>
+        <w:br/>
+      </w:r>
+    </w:p>
+    <w:p>
+      <w:pPr>
+        <w:pStyle w:val="Listaszerbekezds"/>
+        <w:numPr>
+          <w:ilvl w:val="0"/>
+          <w:numId w:val="1"/>
+        </w:numPr>
+      </w:pPr>
+      <w:r>
+        <w:t>GitHub</w:t>
+      </w:r>
+    </w:p>
+    <w:p>
+      <w:pPr>
+        <w:pStyle w:val="Listaszerbekezds"/>
+        <w:numPr>
+          <w:ilvl w:val="0"/>
+          <w:numId w:val="1"/>
+        </w:numPr>
+      </w:pPr>
+      <w:r>
+        <w:t>Rider</w:t>
+      </w:r>
+    </w:p>
+    <w:p>
+      <w:pPr>
+        <w:pStyle w:val="Listaszerbekezds"/>
+        <w:numPr>
+          <w:ilvl w:val="0"/>
+          <w:numId w:val="1"/>
+        </w:numPr>
+      </w:pPr>
+      <w:r>
+        <w:t>DBeaver</w:t>
+      </w:r>
+    </w:p>
+    <w:p/>
+    <w:p>
+      <w:r>
+        <w:t>A fejlesztéshez használt technológia:</w:t>
+      </w:r>
+    </w:p>
+    <w:p/>
+    <w:p>
+      <w:pPr>
+        <w:pStyle w:val="Listaszerbekezds"/>
+        <w:numPr>
+          <w:ilvl w:val="0"/>
+          <w:numId w:val="1"/>
+        </w:numPr>
+      </w:pPr>
+      <w:r>
+        <w:t>Adatbázis-motor: PostgreSQL</w:t>
+      </w:r>
+    </w:p>
+    <w:p>
+      <w:pPr>
+        <w:pStyle w:val="Listaszerbekezds"/>
+        <w:numPr>
+          <w:ilvl w:val="0"/>
+          <w:numId w:val="1"/>
+        </w:numPr>
+      </w:pPr>
+      <w:r>
+        <w:t>User-kezelés: ASP.NET Core Identity</w:t>
+      </w:r>
+    </w:p>
+    <w:p>
+      <w:pPr>
+        <w:pStyle w:val="Listaszerbekezds"/>
+        <w:numPr>
+          <w:ilvl w:val="0"/>
+          <w:numId w:val="1"/>
+        </w:numPr>
+      </w:pPr>
+      <w:r>
+        <w:t>ORM: EF Core</w:t>
+      </w:r>
+    </w:p>
+    <w:p>
+      <w:pPr>
+        <w:pStyle w:val="Listaszerbekezds"/>
+        <w:numPr>
+          <w:ilvl w:val="0"/>
+          <w:numId w:val="1"/>
+        </w:numPr>
+      </w:pPr>
+      <w:r>
+        <w:t>Keretrendszer: .NET 8.0</w:t>
+      </w:r>
+    </w:p>
+    <w:p>
+      <w:pPr>
+        <w:pStyle w:val="Listaszerbekezds"/>
+        <w:numPr>
+          <w:ilvl w:val="0"/>
+          <w:numId w:val="1"/>
+        </w:numPr>
+      </w:pPr>
+      <w:r>
+        <w:t>WebAPI: ASP.NET</w:t>
+      </w:r>
+    </w:p>
+    <w:p>
+      <w:pPr>
+        <w:pStyle w:val="Listaszerbekezds"/>
+        <w:numPr>
+          <w:ilvl w:val="0"/>
+          <w:numId w:val="1"/>
+        </w:numPr>
+      </w:pPr>
+      <w:r>
+        <w:t>Admin és szavazói felület: Blazor WebAssembly Standalone</w:t>
+      </w:r>
+    </w:p>
+    <w:p>
+      <w:pPr>
+        <w:pStyle w:val="Listaszerbekezds"/>
+        <w:numPr>
+          <w:ilvl w:val="0"/>
+          <w:numId w:val="1"/>
+        </w:numPr>
+      </w:pPr>
+      <w:r>
+        <w:t>Elő kétirányú kommunikáció: ASP.NET SignalR</w:t>
+      </w:r>
+    </w:p>
+    <w:p>
+      <w:pPr>
+        <w:pStyle w:val="Listaszerbekezds"/>
+        <w:numPr>
+          <w:ilvl w:val="0"/>
+          <w:numId w:val="1"/>
+        </w:numPr>
+      </w:pPr>
+      <w:r>
+        <w:t>Docker: szerverre kihelyezéshez, későbbi használathoz</w:t>
+      </w:r>
+    </w:p>
+    <w:p>
+      <w:pPr>
+        <w:pStyle w:val="Listaszerbekezds"/>
+        <w:numPr>
+          <w:ilvl w:val="0"/>
+          <w:numId w:val="1"/>
+        </w:numPr>
+      </w:pPr>
+      <w:r>
+        <w:t>Nginx: docker-es kihelyezéskor a Blazor alkalmazások elérhetővé tételéhez</w:t>
+      </w:r>
+    </w:p>
+    <w:p>
+      <w:pPr>
+        <w:pStyle w:val="Listaszerbekezds"/>
+        <w:numPr>
+          <w:ilvl w:val="0"/>
+          <w:numId w:val="1"/>
+        </w:numPr>
+      </w:pPr>
+      <w:r>
+        <w:t>Jenkins: automatikus tesztelés, code coverage generálás</w:t>
+      </w:r>
+    </w:p>
+    <w:p>
+      <w:pPr>
+        <w:pStyle w:val="Listaszerbekezds"/>
+        <w:numPr>
+          <w:ilvl w:val="0"/>
+          <w:numId w:val="1"/>
+        </w:numPr>
+      </w:pPr>
+      <w:r>
+        <w:t>SonarQube: code quality</w:t>
+      </w:r>
+    </w:p>
+    <w:p/>
+    <w:p>
+      <w:pPr>
+        <w:rPr>
+          <w:b/>
+          <w:bCs/>
+        </w:rPr>
+      </w:pPr>
+      <w:r>
+        <w:rPr>
+          <w:b/>
+          <w:bCs/>
+        </w:rPr>
+        <w:br w:type="page"/>
+      </w:r>
+    </w:p>
+    <w:p>
+      <w:pPr>
+        <w:rPr>
+          <w:b/>
+          <w:bCs/>
+        </w:rPr>
+      </w:pPr>
+      <w:r>
+        <w:rPr>
+          <w:b/>
+          <w:bCs/>
+        </w:rPr>
+        <w:lastRenderedPageBreak/>
+        <w:t>Admin felület:</w:t>
+      </w:r>
+    </w:p>
+    <w:p>
+      <w:pPr>
+        <w:rPr>
+          <w:b/>
+          <w:bCs/>
+        </w:rPr>
+      </w:pPr>
+    </w:p>
+    <w:p>
+      <w:r>
+        <w:t>Az Admin felület feladata a két szerepkör alapján kettéválasztható. Minden felhasználó számára elérhető. A közös felületek a következők:</w:t>
+      </w:r>
+    </w:p>
+    <w:p/>
+    <w:p>
+      <w:r>
+        <w:rPr>
+          <w:i/>
+          <w:iCs/>
+        </w:rPr>
+        <w:t>Login page: (/login)</w:t>
+      </w:r>
+      <w:r>
+        <w:t>: a bejelentkezéshez használt felület. Innen elérhető az elfelejtett jelszó, illetve regisztrációs oldal is.</w:t>
+      </w:r>
+    </w:p>
+    <w:p/>
+    <w:p>
+      <w:r>
+        <w:rPr>
+          <w:i/>
+          <w:iCs/>
+        </w:rPr>
+        <w:t>Forgot password page (/forgot-password)</w:t>
+      </w:r>
+      <w:r>
+        <w:t xml:space="preserve">: ha a felhasználó elfelejti jelszavát, itt kérhet </w:t>
+      </w:r>
+      <w:r>
+        <w:t>új jelszót</w:t>
+      </w:r>
+      <w:r>
+        <w:t xml:space="preserve"> a megadott email-címre.</w:t>
+      </w:r>
+    </w:p>
+    <w:p/>
+    <w:p>
+      <w:r>
+        <w:rPr>
+          <w:i/>
+          <w:iCs/>
+        </w:rPr>
+        <w:t>Register page (/register)</w:t>
+      </w:r>
+      <w:r>
+        <w:t>: itt lehet új felhasználóként regisztrálni az oldalra.</w:t>
+      </w:r>
+    </w:p>
+    <w:p/>
+    <w:p>
+      <w:r>
+        <w:rPr>
+          <w:i/>
+          <w:iCs/>
+        </w:rPr>
+        <w:t>Reset password page (/reset-password):</w:t>
+      </w:r>
+      <w:r>
+        <w:t xml:space="preserve"> a jelszó visszaállításához használt felület, az emailben küldött linkről érhető el.</w:t>
+      </w:r>
+    </w:p>
+    <w:p/>
+    <w:p>
+      <w:r>
+        <w:rPr>
+          <w:i/>
+          <w:iCs/>
+        </w:rPr>
+        <w:t>Confirm email page (/confirm-email):</w:t>
+      </w:r>
+      <w:r>
+        <w:t xml:space="preserve"> Az emailben küldött linkről érhető el, az oldalon található ’Confirm Email’ gomb megnyomásával erősíthető meg a felhasználó email-címe.</w:t>
+      </w:r>
+    </w:p>
+    <w:p/>
+    <w:p>
+      <w:r>
+        <w:rPr>
+          <w:i/>
+          <w:iCs/>
+        </w:rPr>
+        <w:t>Settings page (/settings):</w:t>
+      </w:r>
+      <w:r>
+        <w:t xml:space="preserve"> a felhasználó fiókjának alapvető adatait találhatja itt, mint pl. email-cím, szerepkör. Jelszó változtatására itt van lehetőség, email-cím megerősítésére is, illetve itt lehet elfelejtett jelszó esetén jelszó visszaállító emailt kérni.</w:t>
+      </w:r>
+    </w:p>
+    <w:p>
+      <w:r>
+        <w:br/>
+      </w:r>
+      <w:r>
+        <w:rPr>
+          <w:i/>
+          <w:iCs/>
+        </w:rPr>
+        <w:t>Index page (/votings):</w:t>
+      </w:r>
+      <w:r>
+        <w:t xml:space="preserve"> itt találhatja a felhasználó az általa kiírt szavazásokat. Három részre bontható, megkezdett, jövőbeli, és lezárult szavazásokra. Itt törölni is van lehetőség a szavazatokat, illetve szerkeszteni.</w:t>
+      </w:r>
+    </w:p>
+    <w:p>
+      <w:pPr>
+        <w:pStyle w:val="Listaszerbekezds"/>
+        <w:numPr>
+          <w:ilvl w:val="0"/>
+          <w:numId w:val="1"/>
+        </w:numPr>
+      </w:pPr>
+      <w:r>
+        <w:t>Userként: csak az általa kiírt szavazások láthatóak, illetve van lehetőség törölni, szerkeszteni</w:t>
+      </w:r>
+    </w:p>
+    <w:p>
+      <w:pPr>
+        <w:pStyle w:val="Listaszerbekezds"/>
+        <w:numPr>
+          <w:ilvl w:val="0"/>
+          <w:numId w:val="1"/>
+        </w:numPr>
+      </w:pPr>
+      <w:r>
+        <w:t>Adminként: minden szavazás látható, de csak törölni van lehetőség</w:t>
+      </w:r>
+    </w:p>
+    <w:p/>
+    <w:p/>
+    <w:p>
+      <w:r>
+        <w:t>Aki ’Admin’ szerepkört kap, annak a következő lehetőségei vannak:</w:t>
+      </w:r>
+    </w:p>
+    <w:p/>
+    <w:p>
+      <w:r>
+        <w:rPr>
+          <w:i/>
+          <w:iCs/>
+        </w:rPr>
+        <w:t xml:space="preserve">Manage users page (/users): </w:t>
+      </w:r>
+      <w:r>
+        <w:t>Ezen az oldalon minden regisztrált felhasználó, és szerepköre listázásra kerül. A User-ek Admin-ná, illetve Admin-ról User-ré fel- és leléptetés érhető itt el (természetesen az Admin önmagát nem minősítheti át).</w:t>
+      </w:r>
+      <w:r>
+        <w:rPr>
+          <w:i/>
+          <w:iCs/>
+        </w:rPr>
+        <w:t xml:space="preserve"> </w:t>
+      </w:r>
+    </w:p>
+    <w:p/>
+    <w:p>
+      <w:r>
+        <w:t>Aki ’User’ szerepkört kap, annak a következő lehetőségei vannak:</w:t>
+      </w:r>
+    </w:p>
+    <w:p/>
+    <w:p>
+      <w:r>
+        <w:rPr>
+          <w:i/>
+          <w:iCs/>
+        </w:rPr>
+        <w:t xml:space="preserve">Create voting page (/votings/create): </w:t>
+      </w:r>
+      <w:r>
+        <w:t>A felhasználó itt egy nevet (nem változtatható később), illetve kezdő- és befejező időpontot megadva létrehozhat egy új szavazást, mely a szerkesztői oldalra visz azonnal.</w:t>
+      </w:r>
+    </w:p>
+    <w:p/>
+    <w:p>
+      <w:r>
+        <w:rPr>
+          <w:i/>
+          <w:iCs/>
+        </w:rPr>
+        <w:t xml:space="preserve">Edit voting page (/votings/{id}): </w:t>
+      </w:r>
+      <w:r>
+        <w:t xml:space="preserve">Itt lehet a szavazás kezdő- és végpontját, illetve az elérhető szavazati opciókat szerkeszteni, valamint a szavazást elindítani. Egy szavazás akkor indítható el, ha van legalább 2 elérhető választási lehetőség. Ha ez teljesül, akkor </w:t>
+      </w:r>
+      <w:r>
+        <w:lastRenderedPageBreak/>
+        <w:t>a szavazás magától is elindul, amint a kezdő időpont eljön, de manuálisan is elindítható erről a felületről.</w:t>
+      </w:r>
+    </w:p>
+    <w:p/>
+    <w:p>
+      <w:pPr>
+        <w:rPr>
+          <w:b/>
+          <w:bCs/>
+        </w:rPr>
+      </w:pPr>
+      <w:r>
+        <w:rPr>
+          <w:b/>
+          <w:bCs/>
+        </w:rPr>
+        <w:t>Szavazói</w:t>
+      </w:r>
+      <w:r>
+        <w:rPr>
+          <w:b/>
+          <w:bCs/>
+        </w:rPr>
+        <w:t xml:space="preserve"> felület:</w:t>
+      </w:r>
+    </w:p>
+    <w:p/>
+    <w:p>
+      <w:r>
+        <w:t>A szavazói felület Admin felhasználók számára nem érhető el, ők átirányítást kapnak az Admin felületre bejelentkezéskor. A szavazói felület feladat a szavazatok leadása, illetve a leadott szavazatok megtekintése. Három felület elérhető:</w:t>
+      </w:r>
+      <w:r>
+        <w:br/>
+      </w:r>
+      <w:r>
+        <w:br/>
+      </w:r>
+      <w:r>
+        <w:rPr>
+          <w:i/>
+          <w:iCs/>
+        </w:rPr>
+        <w:t xml:space="preserve">Index page (/home): </w:t>
+      </w:r>
+      <w:r>
+        <w:t>A felhasználó itt találja a számára elérhető szavazásokat. Ha az egyikre rákattint, akkor a szavazói oldalra kerül.</w:t>
+      </w:r>
+    </w:p>
+    <w:p/>
+    <w:p>
+      <w:r>
+        <w:rPr>
+          <w:i/>
+          <w:iCs/>
+        </w:rPr>
+        <w:t xml:space="preserve">Vote page (/voting/{id}): </w:t>
+      </w:r>
+      <w:r>
+        <w:t>Itt van lehetőség a megadott lehetőségek egyikére szavazni. A szavazat nem visszavonható, amiről a felhasználó szavazás előtt tájékoztatást is kap.</w:t>
+      </w:r>
+    </w:p>
+    <w:p/>
+    <w:p>
+      <w:pPr>
+        <w:rPr>
+          <w:b/>
+          <w:bCs/>
+        </w:rPr>
+      </w:pPr>
+      <w:r>
+        <w:rPr>
+          <w:i/>
+          <w:iCs/>
+        </w:rPr>
+        <w:t xml:space="preserve">History page (/history): </w:t>
+      </w:r>
+      <w:r>
+        <w:t>Itt találja a felhasználó a már leadott szavazatait. Látja a választott opciót, illetve a szavazati arányokat is, amely élőben is frissül.</w:t>
+      </w:r>
+      <w:r>
+        <w:br/>
+      </w:r>
+      <w:r>
+        <w:br/>
+      </w:r>
+      <w:r>
+        <w:rPr>
+          <w:b/>
+          <w:bCs/>
+        </w:rPr>
+        <w:t>Statikus terv:</w:t>
+      </w:r>
+    </w:p>
+    <w:p>
+      <w:pPr>
+        <w:rPr>
+          <w:b/>
+          <w:bCs/>
+        </w:rPr>
+      </w:pPr>
+    </w:p>
+    <w:p>
+      <w:r>
+        <w:t>A rendszer statikus tervezete a docs/ mappában található. Elérhető az adatbázis séma (db_schema.png), valamint UML diagramok (puml/) illetve komponens diagram (puml/</w:t>
+      </w:r>
+      <w:r>
+        <w:t xml:space="preserve"> components</w:t>
+      </w:r>
+      <w:r>
+        <w:t>.png.</w:t>
+      </w:r>
+    </w:p>
+    <w:p/>
+    <w:p>
+      <w:pPr>
+        <w:rPr>
+          <w:b/>
+          <w:bCs/>
+        </w:rPr>
+      </w:pPr>
+      <w:r>
+        <w:rPr>
+          <w:b/>
+          <w:bCs/>
+        </w:rPr>
+        <w:t>Tesztelés:</w:t>
+      </w:r>
+    </w:p>
+    <w:p>
+      <w:pPr>
+        <w:rPr>
+          <w:b/>
+          <w:bCs/>
+        </w:rPr>
+      </w:pPr>
+    </w:p>
+    <w:p>
+      <w:r>
+        <w:t>A rendszer tesztelése alapos, több rétegben történik. Az első tesztelési folyamat a DataAccess réteg tesztelése, mely a VoterSystem.Tests.Unit projekten belül történik. Itt teszteljük az összes, alapfeladat részét képző Service osztályt (kivétel: EmailService), és biztosítjuk a működésüket.</w:t>
+      </w:r>
+    </w:p>
+    <w:p/>
+    <w:p>
+      <w:r>
+        <w:t>A következő réteg a web API tesztelése, mely integrációs tesztekkel, konténerben elhelyezett teszt-adatbázissal történik, HTTP hívásokon keresztül. Itt azt teszteljük, hogy a megfelelő végpontok hívása megfelelő státusz kódot eredményez-e, hiszen a unit tesztekben már tesztelésre került az elvárt hatás. Itt történik továbbá a SignalR tesztelése, melyhez csak bejelentkezve férünk hozzá, és teszteljük, hogy a szavazati eredmények frissülését megkapja-e az, akinek joga van hozzá.</w:t>
+      </w:r>
+    </w:p>
+    <w:p/>
+    <w:p>
+      <w:r>
+        <w:t>A legutolsó réteg az admin felület felülettesztelése, mely a bUnit keretrendszerrel komponens tesztekkel történik. Itt azt ellenőrizzük, hogy a felületen megjelenő komponensek ténylegesen elérhetőek, illetve több helyen különböző felhasználói interakciót is szimulálunk.</w:t>
+      </w:r>
+    </w:p>
+    <w:p/>
+    <w:p>
+      <w:r>
+        <w:t>A tesztek futtahatóak bárhol, viszont az integrációs tesztek csak a háttérben futó Docker Engine jelenlétében futtahatóak a Postgres konténer miatt.</w:t>
+      </w:r>
+    </w:p>
+    <w:p/>
+    <w:p>
+      <w:r>
+        <w:lastRenderedPageBreak/>
+        <w:t>A manuális tesztelést elősegíti a DataAccess rétegbe beépített DbInitializer osztály, melynek segítségével az adatbázisban elhelyezünk felhasználókat, szavazásokat, szavazatokat, és szavazati opciókat is, így könnyedén ellenőrizhetőek a különböző szituációk. Emellett elérhető a web API-hoz egy Swagger UI oldal, aminek segítségével célirányosan a végpontok is könnyen tesztelhetővé válnak.</w:t>
+      </w:r>
+    </w:p>
+    <w:p>
+      <w:pPr>
+        <w:rPr>
+          <w:b/>
+          <w:bCs/>
+        </w:rPr>
+      </w:pPr>
+    </w:p>
+    <w:p>
+      <w:pPr>
+        <w:rPr>
+          <w:b/>
+          <w:bCs/>
+        </w:rPr>
+      </w:pPr>
+      <w:r>
+        <w:rPr>
+          <w:b/>
+          <w:bCs/>
+        </w:rPr>
+        <w:t>Kihelyezés, futtatás:</w:t>
+      </w:r>
+    </w:p>
+    <w:p/>
+    <w:p>
+      <w:r>
+        <w:t>A szolgáltatás úgy lett tervezve, hogy könnyen kihelyezhető legyen bárhol. A futtatásnak három különböző módját különböztetjük meg:</w:t>
+      </w:r>
+    </w:p>
+    <w:p/>
+    <w:p>
+      <w:pPr>
+        <w:pStyle w:val="Listaszerbekezds"/>
+        <w:numPr>
+          <w:ilvl w:val="0"/>
+          <w:numId w:val="1"/>
+        </w:numPr>
+      </w:pPr>
+      <w:r>
+        <w:t>Helyi futtatás, Windows: A helyi futtatás esetén az adatbázis, illetve a különböző környezeti változók elérhetőségét kell biztosítani. Technikai okokból Windows-on nem működik a Postgres adatbázist elkészítő docker-compose fájl, így manuálisan kell ezt telepíteni a gépünkre. Ezután a WebAPI projekt UserSecrets fájljában kell definiálni a VoterSystem.Shared.DotEnv.DotEnvConfigEntry-ből készített listában a különböző környezeti változók neveit és értékeit (lásd: .env.example). Ezután a program futtatható.</w:t>
+      </w:r>
+    </w:p>
+    <w:p>
+      <w:pPr>
+        <w:pStyle w:val="Listaszerbekezds"/>
+        <w:numPr>
+          <w:ilvl w:val="0"/>
+          <w:numId w:val="1"/>
+        </w:numPr>
+      </w:pPr>
+      <w:r>
+        <w:t>Helyi futtatás, más platformon: Megegyezik a Windows-os futtatással, viszont itt használható a docker-compose-db.yml fájl, így az adatbázist érdemes Docker segítségével létrehozni.</w:t>
+      </w:r>
+    </w:p>
+    <w:p>
+      <w:pPr>
+        <w:pStyle w:val="Listaszerbekezds"/>
+        <w:numPr>
+          <w:ilvl w:val="0"/>
+          <w:numId w:val="1"/>
+        </w:numPr>
+      </w:pPr>
+      <w:r>
+        <w:t>Szerverre kihelyezés, vagy helyi futtatás teljesen Docker-el (nem működ</w:t>
+      </w:r>
+      <w:r>
+        <w:t>ik jelenleg</w:t>
+      </w:r>
+      <w:r>
+        <w:t>): ez a kihelyezés csak tervben van, a könnyebb tesztelés érdekében, viszont ha  .env.example fájl értékeit áthelyezzük és felülírjuk egy .env fájlba, akkor a docker-compose.yml segítségével rögtön kihelyezhető bármilyen szerverre a teljes szolgáltatás, és használható.</w:t>
+      </w:r>
+      <w:r>
+        <w:t xml:space="preserve"> Ez a módszer az idő szűkössége miatt nem készült el, viszont későbbi fejlesztéseket megkönnyítene.</w:t>
+      </w:r>
     </w:p>
     <w:sectPr>
       <w:pgSz w:w="11906" w:h="16838"/>
@@ -566,7 +1176,7 @@
         <w:kern w:val="2"/>
         <w:sz w:val="24"/>
         <w:szCs w:val="24"/>
-        <w:lang w:val="en-HU" w:eastAsia="en-US" w:bidi="ar-SA"/>
+        <w:lang w:val="hu-HU" w:eastAsia="en-US" w:bidi="ar-SA"/>
         <w14:ligatures w14:val="standardContextual"/>
       </w:rPr>
     </w:rPrDefault>
@@ -950,15 +1560,15 @@
     <w:lsdException w:name="Unresolved Mention" w:semiHidden="1" w:unhideWhenUsed="1"/>
     <w:lsdException w:name="Smart Link" w:semiHidden="1" w:unhideWhenUsed="1"/>
   </w:latentStyles>
-  <w:style w:type="paragraph" w:default="1" w:styleId="Normal">
+  <w:style w:type="paragraph" w:default="1" w:styleId="Norml">
     <w:name w:val="Normal"/>
     <w:qFormat/>
   </w:style>
-  <w:style w:type="paragraph" w:styleId="Heading1">
+  <w:style w:type="paragraph" w:styleId="Cmsor1">
     <w:name w:val="heading 1"/>
-    <w:basedOn w:val="Normal"/>
-    <w:next w:val="Normal"/>
-    <w:link w:val="Heading1Char"/>
+    <w:basedOn w:val="Norml"/>
+    <w:next w:val="Norml"/>
+    <w:link w:val="Cmsor1Char"/>
     <w:uiPriority w:val="9"/>
     <w:qFormat/>
     <w:rsid w:val="00157665"/>
@@ -975,11 +1585,11 @@
       <w:szCs w:val="40"/>
     </w:rPr>
   </w:style>
-  <w:style w:type="paragraph" w:styleId="Heading2">
+  <w:style w:type="paragraph" w:styleId="Cmsor2">
     <w:name w:val="heading 2"/>
-    <w:basedOn w:val="Normal"/>
-    <w:next w:val="Normal"/>
-    <w:link w:val="Heading2Char"/>
+    <w:basedOn w:val="Norml"/>
+    <w:next w:val="Norml"/>
+    <w:link w:val="Cmsor2Char"/>
     <w:uiPriority w:val="9"/>
     <w:semiHidden/>
     <w:unhideWhenUsed/>
@@ -998,11 +1608,11 @@
       <w:szCs w:val="32"/>
     </w:rPr>
   </w:style>
-  <w:style w:type="paragraph" w:styleId="Heading3">
+  <w:style w:type="paragraph" w:styleId="Cmsor3">
     <w:name w:val="heading 3"/>
-    <w:basedOn w:val="Normal"/>
-    <w:next w:val="Normal"/>
-    <w:link w:val="Heading3Char"/>
+    <w:basedOn w:val="Norml"/>
+    <w:next w:val="Norml"/>
+    <w:link w:val="Cmsor3Char"/>
     <w:uiPriority w:val="9"/>
     <w:semiHidden/>
     <w:unhideWhenUsed/>
@@ -1021,11 +1631,11 @@
       <w:szCs w:val="28"/>
     </w:rPr>
   </w:style>
-  <w:style w:type="paragraph" w:styleId="Heading4">
+  <w:style w:type="paragraph" w:styleId="Cmsor4">
     <w:name w:val="heading 4"/>
-    <w:basedOn w:val="Normal"/>
-    <w:next w:val="Normal"/>
-    <w:link w:val="Heading4Char"/>
+    <w:basedOn w:val="Norml"/>
+    <w:next w:val="Norml"/>
+    <w:link w:val="Cmsor4Char"/>
     <w:uiPriority w:val="9"/>
     <w:semiHidden/>
     <w:unhideWhenUsed/>
@@ -1044,11 +1654,11 @@
       <w:color w:val="0F4761" w:themeColor="accent1" w:themeShade="BF"/>
     </w:rPr>
   </w:style>
-  <w:style w:type="paragraph" w:styleId="Heading5">
+  <w:style w:type="paragraph" w:styleId="Cmsor5">
     <w:name w:val="heading 5"/>
-    <w:basedOn w:val="Normal"/>
-    <w:next w:val="Normal"/>
-    <w:link w:val="Heading5Char"/>
+    <w:basedOn w:val="Norml"/>
+    <w:next w:val="Norml"/>
+    <w:link w:val="Cmsor5Char"/>
     <w:uiPriority w:val="9"/>
     <w:semiHidden/>
     <w:unhideWhenUsed/>
@@ -1065,11 +1675,11 @@
       <w:color w:val="0F4761" w:themeColor="accent1" w:themeShade="BF"/>
     </w:rPr>
   </w:style>
-  <w:style w:type="paragraph" w:styleId="Heading6">
+  <w:style w:type="paragraph" w:styleId="Cmsor6">
     <w:name w:val="heading 6"/>
-    <w:basedOn w:val="Normal"/>
-    <w:next w:val="Normal"/>
-    <w:link w:val="Heading6Char"/>
+    <w:basedOn w:val="Norml"/>
+    <w:next w:val="Norml"/>
+    <w:link w:val="Cmsor6Char"/>
     <w:uiPriority w:val="9"/>
     <w:semiHidden/>
     <w:unhideWhenUsed/>
@@ -1088,11 +1698,11 @@
       <w:color w:val="595959" w:themeColor="text1" w:themeTint="A6"/>
     </w:rPr>
   </w:style>
-  <w:style w:type="paragraph" w:styleId="Heading7">
+  <w:style w:type="paragraph" w:styleId="Cmsor7">
     <w:name w:val="heading 7"/>
-    <w:basedOn w:val="Normal"/>
-    <w:next w:val="Normal"/>
-    <w:link w:val="Heading7Char"/>
+    <w:basedOn w:val="Norml"/>
+    <w:next w:val="Norml"/>
+    <w:link w:val="Cmsor7Char"/>
     <w:uiPriority w:val="9"/>
     <w:semiHidden/>
     <w:unhideWhenUsed/>
@@ -1109,11 +1719,11 @@
       <w:color w:val="595959" w:themeColor="text1" w:themeTint="A6"/>
     </w:rPr>
   </w:style>
-  <w:style w:type="paragraph" w:styleId="Heading8">
+  <w:style w:type="paragraph" w:styleId="Cmsor8">
     <w:name w:val="heading 8"/>
-    <w:basedOn w:val="Normal"/>
-    <w:next w:val="Normal"/>
-    <w:link w:val="Heading8Char"/>
+    <w:basedOn w:val="Norml"/>
+    <w:next w:val="Norml"/>
+    <w:link w:val="Cmsor8Char"/>
     <w:uiPriority w:val="9"/>
     <w:semiHidden/>
     <w:unhideWhenUsed/>
@@ -1131,11 +1741,11 @@
       <w:color w:val="272727" w:themeColor="text1" w:themeTint="D8"/>
     </w:rPr>
   </w:style>
-  <w:style w:type="paragraph" w:styleId="Heading9">
+  <w:style w:type="paragraph" w:styleId="Cmsor9">
     <w:name w:val="heading 9"/>
-    <w:basedOn w:val="Normal"/>
-    <w:next w:val="Normal"/>
-    <w:link w:val="Heading9Char"/>
+    <w:basedOn w:val="Norml"/>
+    <w:next w:val="Norml"/>
+    <w:link w:val="Cmsor9Char"/>
     <w:uiPriority w:val="9"/>
     <w:semiHidden/>
     <w:unhideWhenUsed/>
@@ -1151,13 +1761,13 @@
       <w:color w:val="272727" w:themeColor="text1" w:themeTint="D8"/>
     </w:rPr>
   </w:style>
-  <w:style w:type="character" w:default="1" w:styleId="DefaultParagraphFont">
+  <w:style w:type="character" w:default="1" w:styleId="Bekezdsalapbettpusa">
     <w:name w:val="Default Paragraph Font"/>
     <w:uiPriority w:val="1"/>
     <w:semiHidden/>
     <w:unhideWhenUsed/>
   </w:style>
-  <w:style w:type="table" w:default="1" w:styleId="TableNormal">
+  <w:style w:type="table" w:default="1" w:styleId="Normltblzat">
     <w:name w:val="Normal Table"/>
     <w:uiPriority w:val="99"/>
     <w:semiHidden/>
@@ -1172,16 +1782,16 @@
       </w:tblCellMar>
     </w:tblPr>
   </w:style>
-  <w:style w:type="numbering" w:default="1" w:styleId="NoList">
+  <w:style w:type="numbering" w:default="1" w:styleId="Nemlista">
     <w:name w:val="No List"/>
     <w:uiPriority w:val="99"/>
     <w:semiHidden/>
     <w:unhideWhenUsed/>
   </w:style>
-  <w:style w:type="character" w:customStyle="1" w:styleId="Heading1Char">
-    <w:name w:val="Heading 1 Char"/>
-    <w:basedOn w:val="DefaultParagraphFont"/>
-    <w:link w:val="Heading1"/>
+  <w:style w:type="character" w:customStyle="1" w:styleId="Cmsor1Char">
+    <w:name w:val="Címsor 1 Char"/>
+    <w:basedOn w:val="Bekezdsalapbettpusa"/>
+    <w:link w:val="Cmsor1"/>
     <w:uiPriority w:val="9"/>
     <w:rsid w:val="00157665"/>
     <w:rPr>
@@ -1191,10 +1801,10 @@
       <w:szCs w:val="40"/>
     </w:rPr>
   </w:style>
-  <w:style w:type="character" w:customStyle="1" w:styleId="Heading2Char">
-    <w:name w:val="Heading 2 Char"/>
-    <w:basedOn w:val="DefaultParagraphFont"/>
-    <w:link w:val="Heading2"/>
+  <w:style w:type="character" w:customStyle="1" w:styleId="Cmsor2Char">
+    <w:name w:val="Címsor 2 Char"/>
+    <w:basedOn w:val="Bekezdsalapbettpusa"/>
+    <w:link w:val="Cmsor2"/>
     <w:uiPriority w:val="9"/>
     <w:semiHidden/>
     <w:rsid w:val="00157665"/>
@@ -1205,10 +1815,10 @@
       <w:szCs w:val="32"/>
     </w:rPr>
   </w:style>
-  <w:style w:type="character" w:customStyle="1" w:styleId="Heading3Char">
-    <w:name w:val="Heading 3 Char"/>
-    <w:basedOn w:val="DefaultParagraphFont"/>
-    <w:link w:val="Heading3"/>
+  <w:style w:type="character" w:customStyle="1" w:styleId="Cmsor3Char">
+    <w:name w:val="Címsor 3 Char"/>
+    <w:basedOn w:val="Bekezdsalapbettpusa"/>
+    <w:link w:val="Cmsor3"/>
     <w:uiPriority w:val="9"/>
     <w:semiHidden/>
     <w:rsid w:val="00157665"/>
@@ -1219,10 +1829,10 @@
       <w:szCs w:val="28"/>
     </w:rPr>
   </w:style>
-  <w:style w:type="character" w:customStyle="1" w:styleId="Heading4Char">
-    <w:name w:val="Heading 4 Char"/>
-    <w:basedOn w:val="DefaultParagraphFont"/>
-    <w:link w:val="Heading4"/>
+  <w:style w:type="character" w:customStyle="1" w:styleId="Cmsor4Char">
+    <w:name w:val="Címsor 4 Char"/>
+    <w:basedOn w:val="Bekezdsalapbettpusa"/>
+    <w:link w:val="Cmsor4"/>
     <w:uiPriority w:val="9"/>
     <w:semiHidden/>
     <w:rsid w:val="00157665"/>
@@ -1233,10 +1843,10 @@
       <w:color w:val="0F4761" w:themeColor="accent1" w:themeShade="BF"/>
     </w:rPr>
   </w:style>
-  <w:style w:type="character" w:customStyle="1" w:styleId="Heading5Char">
-    <w:name w:val="Heading 5 Char"/>
-    <w:basedOn w:val="DefaultParagraphFont"/>
-    <w:link w:val="Heading5"/>
+  <w:style w:type="character" w:customStyle="1" w:styleId="Cmsor5Char">
+    <w:name w:val="Címsor 5 Char"/>
+    <w:basedOn w:val="Bekezdsalapbettpusa"/>
+    <w:link w:val="Cmsor5"/>
     <w:uiPriority w:val="9"/>
     <w:semiHidden/>
     <w:rsid w:val="00157665"/>
@@ -1245,10 +1855,10 @@
       <w:color w:val="0F4761" w:themeColor="accent1" w:themeShade="BF"/>
     </w:rPr>
   </w:style>
-  <w:style w:type="character" w:customStyle="1" w:styleId="Heading6Char">
-    <w:name w:val="Heading 6 Char"/>
-    <w:basedOn w:val="DefaultParagraphFont"/>
-    <w:link w:val="Heading6"/>
+  <w:style w:type="character" w:customStyle="1" w:styleId="Cmsor6Char">
+    <w:name w:val="Címsor 6 Char"/>
+    <w:basedOn w:val="Bekezdsalapbettpusa"/>
+    <w:link w:val="Cmsor6"/>
     <w:uiPriority w:val="9"/>
     <w:semiHidden/>
     <w:rsid w:val="00157665"/>
@@ -1259,10 +1869,10 @@
       <w:color w:val="595959" w:themeColor="text1" w:themeTint="A6"/>
     </w:rPr>
   </w:style>
-  <w:style w:type="character" w:customStyle="1" w:styleId="Heading7Char">
-    <w:name w:val="Heading 7 Char"/>
-    <w:basedOn w:val="DefaultParagraphFont"/>
-    <w:link w:val="Heading7"/>
+  <w:style w:type="character" w:customStyle="1" w:styleId="Cmsor7Char">
+    <w:name w:val="Címsor 7 Char"/>
+    <w:basedOn w:val="Bekezdsalapbettpusa"/>
+    <w:link w:val="Cmsor7"/>
     <w:uiPriority w:val="9"/>
     <w:semiHidden/>
     <w:rsid w:val="00157665"/>
@@ -1271,10 +1881,10 @@
       <w:color w:val="595959" w:themeColor="text1" w:themeTint="A6"/>
     </w:rPr>
   </w:style>
-  <w:style w:type="character" w:customStyle="1" w:styleId="Heading8Char">
-    <w:name w:val="Heading 8 Char"/>
-    <w:basedOn w:val="DefaultParagraphFont"/>
-    <w:link w:val="Heading8"/>
+  <w:style w:type="character" w:customStyle="1" w:styleId="Cmsor8Char">
+    <w:name w:val="Címsor 8 Char"/>
+    <w:basedOn w:val="Bekezdsalapbettpusa"/>
+    <w:link w:val="Cmsor8"/>
     <w:uiPriority w:val="9"/>
     <w:semiHidden/>
     <w:rsid w:val="00157665"/>
@@ -1285,10 +1895,10 @@
       <w:color w:val="272727" w:themeColor="text1" w:themeTint="D8"/>
     </w:rPr>
   </w:style>
-  <w:style w:type="character" w:customStyle="1" w:styleId="Heading9Char">
-    <w:name w:val="Heading 9 Char"/>
-    <w:basedOn w:val="DefaultParagraphFont"/>
-    <w:link w:val="Heading9"/>
+  <w:style w:type="character" w:customStyle="1" w:styleId="Cmsor9Char">
+    <w:name w:val="Címsor 9 Char"/>
+    <w:basedOn w:val="Bekezdsalapbettpusa"/>
+    <w:link w:val="Cmsor9"/>
     <w:uiPriority w:val="9"/>
     <w:semiHidden/>
     <w:rsid w:val="00157665"/>
@@ -1297,11 +1907,11 @@
       <w:color w:val="272727" w:themeColor="text1" w:themeTint="D8"/>
     </w:rPr>
   </w:style>
-  <w:style w:type="paragraph" w:styleId="Title">
+  <w:style w:type="paragraph" w:styleId="Cm">
     <w:name w:val="Title"/>
-    <w:basedOn w:val="Normal"/>
-    <w:next w:val="Normal"/>
-    <w:link w:val="TitleChar"/>
+    <w:basedOn w:val="Norml"/>
+    <w:next w:val="Norml"/>
+    <w:link w:val="CmChar"/>
     <w:uiPriority w:val="10"/>
     <w:qFormat/>
     <w:rsid w:val="00157665"/>
@@ -1317,10 +1927,10 @@
       <w:szCs w:val="56"/>
     </w:rPr>
   </w:style>
-  <w:style w:type="character" w:customStyle="1" w:styleId="TitleChar">
-    <w:name w:val="Title Char"/>
-    <w:basedOn w:val="DefaultParagraphFont"/>
-    <w:link w:val="Title"/>
+  <w:style w:type="character" w:customStyle="1" w:styleId="CmChar">
+    <w:name w:val="Cím Char"/>
+    <w:basedOn w:val="Bekezdsalapbettpusa"/>
+    <w:link w:val="Cm"/>
     <w:uiPriority w:val="10"/>
     <w:rsid w:val="00157665"/>
     <w:rPr>
@@ -1331,11 +1941,11 @@
       <w:szCs w:val="56"/>
     </w:rPr>
   </w:style>
-  <w:style w:type="paragraph" w:styleId="Subtitle">
+  <w:style w:type="paragraph" w:styleId="Alcm">
     <w:name w:val="Subtitle"/>
-    <w:basedOn w:val="Normal"/>
-    <w:next w:val="Normal"/>
-    <w:link w:val="SubtitleChar"/>
+    <w:basedOn w:val="Norml"/>
+    <w:next w:val="Norml"/>
+    <w:link w:val="AlcmChar"/>
     <w:uiPriority w:val="11"/>
     <w:qFormat/>
     <w:rsid w:val="00157665"/>
@@ -1353,10 +1963,10 @@
       <w:szCs w:val="28"/>
     </w:rPr>
   </w:style>
-  <w:style w:type="character" w:customStyle="1" w:styleId="SubtitleChar">
-    <w:name w:val="Subtitle Char"/>
-    <w:basedOn w:val="DefaultParagraphFont"/>
-    <w:link w:val="Subtitle"/>
+  <w:style w:type="character" w:customStyle="1" w:styleId="AlcmChar">
+    <w:name w:val="Alcím Char"/>
+    <w:basedOn w:val="Bekezdsalapbettpusa"/>
+    <w:link w:val="Alcm"/>
     <w:uiPriority w:val="11"/>
     <w:rsid w:val="00157665"/>
     <w:rPr>
@@ -1367,11 +1977,11 @@
       <w:szCs w:val="28"/>
     </w:rPr>
   </w:style>
-  <w:style w:type="paragraph" w:styleId="Quote">
+  <w:style w:type="paragraph" w:styleId="Idzet">
     <w:name w:val="Quote"/>
-    <w:basedOn w:val="Normal"/>
-    <w:next w:val="Normal"/>
-    <w:link w:val="QuoteChar"/>
+    <w:basedOn w:val="Norml"/>
+    <w:next w:val="Norml"/>
+    <w:link w:val="IdzetChar"/>
     <w:uiPriority w:val="29"/>
     <w:qFormat/>
     <w:rsid w:val="00157665"/>
@@ -1385,10 +1995,10 @@
       <w:color w:val="404040" w:themeColor="text1" w:themeTint="BF"/>
     </w:rPr>
   </w:style>
-  <w:style w:type="character" w:customStyle="1" w:styleId="QuoteChar">
-    <w:name w:val="Quote Char"/>
-    <w:basedOn w:val="DefaultParagraphFont"/>
-    <w:link w:val="Quote"/>
+  <w:style w:type="character" w:customStyle="1" w:styleId="IdzetChar">
+    <w:name w:val="Idézet Char"/>
+    <w:basedOn w:val="Bekezdsalapbettpusa"/>
+    <w:link w:val="Idzet"/>
     <w:uiPriority w:val="29"/>
     <w:rsid w:val="00157665"/>
     <w:rPr>
@@ -1397,9 +2007,9 @@
       <w:color w:val="404040" w:themeColor="text1" w:themeTint="BF"/>
     </w:rPr>
   </w:style>
-  <w:style w:type="paragraph" w:styleId="ListParagraph">
+  <w:style w:type="paragraph" w:styleId="Listaszerbekezds">
     <w:name w:val="List Paragraph"/>
-    <w:basedOn w:val="Normal"/>
+    <w:basedOn w:val="Norml"/>
     <w:uiPriority w:val="34"/>
     <w:qFormat/>
     <w:rsid w:val="00157665"/>
@@ -1408,9 +2018,9 @@
       <w:contextualSpacing/>
     </w:pPr>
   </w:style>
-  <w:style w:type="character" w:styleId="IntenseEmphasis">
+  <w:style w:type="character" w:styleId="Erskiemels">
     <w:name w:val="Intense Emphasis"/>
-    <w:basedOn w:val="DefaultParagraphFont"/>
+    <w:basedOn w:val="Bekezdsalapbettpusa"/>
     <w:uiPriority w:val="21"/>
     <w:qFormat/>
     <w:rsid w:val="00157665"/>
@@ -1420,11 +2030,11 @@
       <w:color w:val="0F4761" w:themeColor="accent1" w:themeShade="BF"/>
     </w:rPr>
   </w:style>
-  <w:style w:type="paragraph" w:styleId="IntenseQuote">
+  <w:style w:type="paragraph" w:styleId="Kiemeltidzet">
     <w:name w:val="Intense Quote"/>
-    <w:basedOn w:val="Normal"/>
-    <w:next w:val="Normal"/>
-    <w:link w:val="IntenseQuoteChar"/>
+    <w:basedOn w:val="Norml"/>
+    <w:next w:val="Norml"/>
+    <w:link w:val="KiemeltidzetChar"/>
     <w:uiPriority w:val="30"/>
     <w:qFormat/>
     <w:rsid w:val="00157665"/>
@@ -1443,10 +2053,10 @@
       <w:color w:val="0F4761" w:themeColor="accent1" w:themeShade="BF"/>
     </w:rPr>
   </w:style>
-  <w:style w:type="character" w:customStyle="1" w:styleId="IntenseQuoteChar">
-    <w:name w:val="Intense Quote Char"/>
-    <w:basedOn w:val="DefaultParagraphFont"/>
-    <w:link w:val="IntenseQuote"/>
+  <w:style w:type="character" w:customStyle="1" w:styleId="KiemeltidzetChar">
+    <w:name w:val="Kiemelt idézet Char"/>
+    <w:basedOn w:val="Bekezdsalapbettpusa"/>
+    <w:link w:val="Kiemeltidzet"/>
     <w:uiPriority w:val="30"/>
     <w:rsid w:val="00157665"/>
     <w:rPr>
@@ -1455,9 +2065,9 @@
       <w:color w:val="0F4761" w:themeColor="accent1" w:themeShade="BF"/>
     </w:rPr>
   </w:style>
-  <w:style w:type="character" w:styleId="IntenseReference">
+  <w:style w:type="character" w:styleId="Ershivatkozs">
     <w:name w:val="Intense Reference"/>
-    <w:basedOn w:val="DefaultParagraphFont"/>
+    <w:basedOn w:val="Bekezdsalapbettpusa"/>
     <w:uiPriority w:val="32"/>
     <w:qFormat/>
     <w:rsid w:val="00157665"/>
@@ -1471,7 +2081,7 @@
   </w:style>
   <w:style w:type="paragraph" w:customStyle="1" w:styleId="p1">
     <w:name w:val="p1"/>
-    <w:basedOn w:val="Normal"/>
+    <w:basedOn w:val="Norml"/>
     <w:rsid w:val="00157665"/>
     <w:rPr>
       <w:rFonts w:ascii="Helvetica" w:eastAsia="Times New Roman" w:hAnsi="Helvetica" w:cs="Times New Roman"/>
@@ -1485,7 +2095,7 @@
   </w:style>
   <w:style w:type="paragraph" w:customStyle="1" w:styleId="p2">
     <w:name w:val="p2"/>
-    <w:basedOn w:val="Normal"/>
+    <w:basedOn w:val="Norml"/>
     <w:rsid w:val="00157665"/>
     <w:rPr>
       <w:rFonts w:ascii="Helvetica" w:eastAsia="Times New Roman" w:hAnsi="Helvetica" w:cs="Times New Roman"/>
@@ -1499,7 +2109,7 @@
   </w:style>
   <w:style w:type="paragraph" w:customStyle="1" w:styleId="p3">
     <w:name w:val="p3"/>
-    <w:basedOn w:val="Normal"/>
+    <w:basedOn w:val="Norml"/>
     <w:rsid w:val="00157665"/>
     <w:rPr>
       <w:rFonts w:ascii="Helvetica" w:eastAsia="Times New Roman" w:hAnsi="Helvetica" w:cs="Times New Roman"/>
@@ -1513,7 +2123,7 @@
   </w:style>
   <w:style w:type="paragraph" w:customStyle="1" w:styleId="p4">
     <w:name w:val="p4"/>
-    <w:basedOn w:val="Normal"/>
+    <w:basedOn w:val="Norml"/>
     <w:rsid w:val="00157665"/>
     <w:rPr>
       <w:rFonts w:ascii="Helvetica" w:eastAsia="Times New Roman" w:hAnsi="Helvetica" w:cs="Times New Roman"/>
@@ -1527,7 +2137,7 @@
   </w:style>
   <w:style w:type="paragraph" w:customStyle="1" w:styleId="p5">
     <w:name w:val="p5"/>
-    <w:basedOn w:val="Normal"/>
+    <w:basedOn w:val="Norml"/>
     <w:rsid w:val="00157665"/>
     <w:rPr>
       <w:rFonts w:ascii="Helvetica" w:eastAsia="Times New Roman" w:hAnsi="Helvetica" w:cs="Times New Roman"/>
@@ -1541,7 +2151,7 @@
   </w:style>
   <w:style w:type="character" w:customStyle="1" w:styleId="s1">
     <w:name w:val="s1"/>
-    <w:basedOn w:val="DefaultParagraphFont"/>
+    <w:basedOn w:val="Bekezdsalapbettpusa"/>
     <w:rsid w:val="00157665"/>
     <w:rPr>
       <w:rFonts w:ascii="Helvetica" w:hAnsi="Helvetica" w:hint="default"/>
@@ -1551,7 +2161,7 @@
   </w:style>
   <w:style w:type="character" w:customStyle="1" w:styleId="s2">
     <w:name w:val="s2"/>
-    <w:basedOn w:val="DefaultParagraphFont"/>
+    <w:basedOn w:val="Bekezdsalapbettpusa"/>
     <w:rsid w:val="00157665"/>
     <w:rPr>
       <w:rFonts w:ascii="Helvetica" w:hAnsi="Helvetica" w:hint="default"/>

</xml_diff>

<commit_message>
Updated links to the test prod
</commit_message>
<xml_diff>
--- a/docs/documentation.docx
+++ b/docs/documentation.docx
@@ -4,14 +4,22 @@
   <w:body>
     <w:p>
       <w:pPr>
-        <w:pStyle w:val="Cm"/>
+        <w:pStyle w:val="Title"/>
       </w:pPr>
       <w:r>
         <w:rPr>
           <w:lang w:val="en-US"/>
         </w:rPr>
-        <w:t>Modern .NET beadand</w:t>
-      </w:r>
+        <w:t xml:space="preserve">Modern .NET </w:t>
+      </w:r>
+      <w:proofErr w:type="spellStart"/>
+      <w:r>
+        <w:rPr>
+          <w:lang w:val="en-US"/>
+        </w:rPr>
+        <w:t>beadand</w:t>
+      </w:r>
+      <w:proofErr w:type="spellEnd"/>
       <w:r>
         <w:t>ó</w:t>
       </w:r>
@@ -23,8 +31,13 @@
       </w:r>
     </w:p>
     <w:p>
-      <w:r>
-        <w:t>Neptun-kód: ROXFTL</w:t>
+      <w:proofErr w:type="spellStart"/>
+      <w:r>
+        <w:t>Neptun</w:t>
+      </w:r>
+      <w:proofErr w:type="spellEnd"/>
+      <w:r>
+        <w:t>-kód: ROXFTL</w:t>
       </w:r>
     </w:p>
     <w:p>
@@ -56,7 +69,15 @@
     </w:p>
     <w:p>
       <w:r>
-        <w:t>A docs mappában található voting_system.pdf fájlban található.</w:t>
+        <w:t xml:space="preserve">A </w:t>
+      </w:r>
+      <w:proofErr w:type="spellStart"/>
+      <w:r>
+        <w:t>docs</w:t>
+      </w:r>
+      <w:proofErr w:type="spellEnd"/>
+      <w:r>
+        <w:t xml:space="preserve"> mappában található voting_system.pdf fájlban található.</w:t>
       </w:r>
     </w:p>
     <w:p>
@@ -106,7 +127,7 @@
     </w:p>
     <w:p>
       <w:pPr>
-        <w:pStyle w:val="Listaszerbekezds"/>
+        <w:pStyle w:val="ListParagraph"/>
         <w:numPr>
           <w:ilvl w:val="0"/>
           <w:numId w:val="1"/>
@@ -124,59 +145,103 @@
     </w:p>
     <w:p>
       <w:pPr>
-        <w:pStyle w:val="Listaszerbekezds"/>
+        <w:pStyle w:val="ListParagraph"/>
         <w:numPr>
           <w:ilvl w:val="1"/>
           <w:numId w:val="1"/>
         </w:numPr>
       </w:pPr>
-      <w:r>
-        <w:t>WebAPI készítés egy szavazati rendszerhez</w:t>
-      </w:r>
-    </w:p>
-    <w:p>
-      <w:pPr>
-        <w:pStyle w:val="Listaszerbekezds"/>
+      <w:proofErr w:type="spellStart"/>
+      <w:r>
+        <w:t>WebAPI</w:t>
+      </w:r>
+      <w:proofErr w:type="spellEnd"/>
+      <w:r>
+        <w:t xml:space="preserve"> készítés egy szavazati rendszerhez</w:t>
+      </w:r>
+    </w:p>
+    <w:p>
+      <w:pPr>
+        <w:pStyle w:val="ListParagraph"/>
         <w:numPr>
           <w:ilvl w:val="1"/>
           <w:numId w:val="1"/>
         </w:numPr>
       </w:pPr>
-      <w:r>
-        <w:t>Blazor Webalkalmazás készítése az adminisztrációs felülethez</w:t>
-      </w:r>
-    </w:p>
-    <w:p>
-      <w:pPr>
-        <w:pStyle w:val="Listaszerbekezds"/>
+      <w:proofErr w:type="spellStart"/>
+      <w:r>
+        <w:t>Blazor</w:t>
+      </w:r>
+      <w:proofErr w:type="spellEnd"/>
+      <w:r>
+        <w:t xml:space="preserve"> Webalkalmazás készítése az adminisztrációs felülethez</w:t>
+      </w:r>
+    </w:p>
+    <w:p>
+      <w:pPr>
+        <w:pStyle w:val="ListParagraph"/>
         <w:numPr>
           <w:ilvl w:val="1"/>
           <w:numId w:val="1"/>
         </w:numPr>
       </w:pPr>
       <w:r>
-        <w:t>Szavazói felület elkészítése szintén Blazorben</w:t>
-      </w:r>
-    </w:p>
-    <w:p>
-      <w:pPr>
-        <w:pStyle w:val="Listaszerbekezds"/>
+        <w:t xml:space="preserve">Szavazói felület elkészítése szintén </w:t>
+      </w:r>
+      <w:proofErr w:type="spellStart"/>
+      <w:r>
+        <w:t>Blazorben</w:t>
+      </w:r>
+      <w:proofErr w:type="spellEnd"/>
+    </w:p>
+    <w:p>
+      <w:pPr>
+        <w:pStyle w:val="ListParagraph"/>
         <w:numPr>
           <w:ilvl w:val="1"/>
           <w:numId w:val="1"/>
         </w:numPr>
       </w:pPr>
       <w:r>
-        <w:t>Az alapfeladat elemeinek tesztelése (DataAccess réteg, Controller integrálási tesztek</w:t>
-      </w:r>
-      <w:r>
-        <w:t>, SignalR integrációs tesztek</w:t>
-      </w:r>
-      <w:r>
-        <w:t xml:space="preserve">, Blazor </w:t>
-      </w:r>
-      <w:r>
-        <w:t>Admin felület</w:t>
+        <w:t xml:space="preserve">Az alapfeladat elemeinek tesztelése (DataAccess réteg, </w:t>
+      </w:r>
+      <w:proofErr w:type="spellStart"/>
+      <w:r>
+        <w:t>Controller</w:t>
+      </w:r>
+      <w:proofErr w:type="spellEnd"/>
+      <w:r>
+        <w:t xml:space="preserve"> integrálási tesztek</w:t>
+      </w:r>
+      <w:r>
+        <w:t xml:space="preserve">, </w:t>
+      </w:r>
+      <w:proofErr w:type="spellStart"/>
+      <w:r>
+        <w:t>SignalR</w:t>
+      </w:r>
+      <w:proofErr w:type="spellEnd"/>
+      <w:r>
+        <w:t xml:space="preserve"> integrációs tesztek</w:t>
+      </w:r>
+      <w:r>
+        <w:t xml:space="preserve">, </w:t>
+      </w:r>
+      <w:proofErr w:type="spellStart"/>
+      <w:r>
+        <w:t>Blazor</w:t>
+      </w:r>
+      <w:proofErr w:type="spellEnd"/>
+      <w:r>
+        <w:t xml:space="preserve"> </w:t>
+      </w:r>
+      <w:proofErr w:type="spellStart"/>
+      <w:r>
+        <w:t>Admin</w:t>
+      </w:r>
+      <w:proofErr w:type="spellEnd"/>
+      <w:r>
+        <w:t xml:space="preserve"> felület</w:t>
       </w:r>
       <w:r>
         <w:t xml:space="preserve"> tesztelése)</w:t>
@@ -184,7 +249,7 @@
     </w:p>
     <w:p>
       <w:pPr>
-        <w:pStyle w:val="Listaszerbekezds"/>
+        <w:pStyle w:val="ListParagraph"/>
         <w:numPr>
           <w:ilvl w:val="1"/>
           <w:numId w:val="1"/>
@@ -196,7 +261,7 @@
     </w:p>
     <w:p>
       <w:pPr>
-        <w:pStyle w:val="Listaszerbekezds"/>
+        <w:pStyle w:val="ListParagraph"/>
         <w:numPr>
           <w:ilvl w:val="0"/>
           <w:numId w:val="1"/>
@@ -208,7 +273,7 @@
     </w:p>
     <w:p>
       <w:pPr>
-        <w:pStyle w:val="Listaszerbekezds"/>
+        <w:pStyle w:val="ListParagraph"/>
         <w:numPr>
           <w:ilvl w:val="0"/>
           <w:numId w:val="1"/>
@@ -220,7 +285,7 @@
     </w:p>
     <w:p>
       <w:pPr>
-        <w:pStyle w:val="Listaszerbekezds"/>
+        <w:pStyle w:val="ListParagraph"/>
         <w:numPr>
           <w:ilvl w:val="0"/>
           <w:numId w:val="1"/>
@@ -232,7 +297,7 @@
     </w:p>
     <w:p>
       <w:pPr>
-        <w:pStyle w:val="Listaszerbekezds"/>
+        <w:pStyle w:val="ListParagraph"/>
         <w:numPr>
           <w:ilvl w:val="0"/>
           <w:numId w:val="1"/>
@@ -244,14 +309,22 @@
     </w:p>
     <w:p>
       <w:pPr>
-        <w:pStyle w:val="Listaszerbekezds"/>
+        <w:pStyle w:val="ListParagraph"/>
         <w:numPr>
           <w:ilvl w:val="0"/>
           <w:numId w:val="1"/>
         </w:numPr>
       </w:pPr>
       <w:r>
-        <w:t xml:space="preserve">Elő eredmények (1 pont, SignalR) </w:t>
+        <w:t xml:space="preserve">Elő eredmények (1 pont, </w:t>
+      </w:r>
+      <w:proofErr w:type="spellStart"/>
+      <w:r>
+        <w:t>SignalR</w:t>
+      </w:r>
+      <w:proofErr w:type="spellEnd"/>
+      <w:r>
+        <w:t xml:space="preserve">) </w:t>
       </w:r>
     </w:p>
     <w:p>
@@ -291,7 +364,15 @@
     </w:p>
     <w:p>
       <w:r>
-        <w:t>A feladat egy olyan szavazói rendszer elkészítése, ahol a felhasználók szavazatokat írhatnak ki, majd szavazhatnak más szavazásain. Szavazatot követően mindenkinek, illetve a szavazást kiíró felhasználónak és az Admin felhasználóknak elérhető egy kimutatás a szavazás eredményéről, mely csupán a szavazás lehetőségeire leadott voksok számát tartalmazza, megőrizve az anonimitást. A felhasználó láthatja, mely szavazaton mire szavazott, és azoknak is az eredményeit. Ezek az eredmények élőben is frissülnek, amíg tart a szavazás.</w:t>
+        <w:t xml:space="preserve">A feladat egy olyan szavazói rendszer elkészítése, ahol a felhasználók szavazatokat írhatnak ki, majd szavazhatnak más szavazásain. Szavazatot követően mindenkinek, illetve a szavazást kiíró felhasználónak és az </w:t>
+      </w:r>
+      <w:proofErr w:type="spellStart"/>
+      <w:r>
+        <w:t>Admin</w:t>
+      </w:r>
+      <w:proofErr w:type="spellEnd"/>
+      <w:r>
+        <w:t xml:space="preserve"> felhasználóknak elérhető egy kimutatás a szavazás eredményéről, mely csupán a szavazás lehetőségeire leadott voksok számát tartalmazza, megőrizve az anonimitást. A felhasználó láthatja, mely szavazaton mire szavazott, és azoknak is az eredményeit. Ezek az eredmények élőben is frissülnek, amíg tart a szavazás.</w:t>
       </w:r>
     </w:p>
     <w:p/>
@@ -302,19 +383,24 @@
     </w:p>
     <w:p>
       <w:pPr>
-        <w:pStyle w:val="Listaszerbekezds"/>
+        <w:pStyle w:val="ListParagraph"/>
         <w:numPr>
           <w:ilvl w:val="0"/>
           <w:numId w:val="1"/>
         </w:numPr>
       </w:pPr>
-      <w:r>
-        <w:t>Admin felület</w:t>
-      </w:r>
-    </w:p>
-    <w:p>
-      <w:pPr>
-        <w:pStyle w:val="Listaszerbekezds"/>
+      <w:proofErr w:type="spellStart"/>
+      <w:r>
+        <w:t>Admin</w:t>
+      </w:r>
+      <w:proofErr w:type="spellEnd"/>
+      <w:r>
+        <w:t xml:space="preserve"> felület</w:t>
+      </w:r>
+    </w:p>
+    <w:p>
+      <w:pPr>
+        <w:pStyle w:val="ListParagraph"/>
         <w:numPr>
           <w:ilvl w:val="0"/>
           <w:numId w:val="1"/>
@@ -326,14 +412,27 @@
     </w:p>
     <w:p>
       <w:pPr>
-        <w:pStyle w:val="Listaszerbekezds"/>
+        <w:pStyle w:val="ListParagraph"/>
         <w:numPr>
           <w:ilvl w:val="0"/>
           <w:numId w:val="1"/>
         </w:numPr>
       </w:pPr>
-      <w:r>
-        <w:t>Swagger felület a WebAPI teszteléséhez (nem nyilvános)</w:t>
+      <w:proofErr w:type="spellStart"/>
+      <w:r>
+        <w:t>Swagger</w:t>
+      </w:r>
+      <w:proofErr w:type="spellEnd"/>
+      <w:r>
+        <w:t xml:space="preserve"> felület a </w:t>
+      </w:r>
+      <w:proofErr w:type="spellStart"/>
+      <w:r>
+        <w:t>WebAPI</w:t>
+      </w:r>
+      <w:proofErr w:type="spellEnd"/>
+      <w:r>
+        <w:t xml:space="preserve"> teszteléséhez (nem nyilvános)</w:t>
       </w:r>
     </w:p>
     <w:p/>
@@ -345,7 +444,39 @@
         </w:rPr>
       </w:pPr>
       <w:r>
-        <w:t>Mindegyik felület az OAuth2 flownak megfelelően az elérési token lejárta után megpróbál a refresh token segítségével hosszabbítani a session-ön, illetve ha nem sikerül, akkor átirányít a bejelentkező oldalra.</w:t>
+        <w:t xml:space="preserve">Mindegyik felület az OAuth2 flownak megfelelően az elérési </w:t>
+      </w:r>
+      <w:proofErr w:type="spellStart"/>
+      <w:r>
+        <w:t>token</w:t>
+      </w:r>
+      <w:proofErr w:type="spellEnd"/>
+      <w:r>
+        <w:t xml:space="preserve"> lejárta után megpróbál a </w:t>
+      </w:r>
+      <w:proofErr w:type="spellStart"/>
+      <w:r>
+        <w:t>refresh</w:t>
+      </w:r>
+      <w:proofErr w:type="spellEnd"/>
+      <w:r>
+        <w:t xml:space="preserve"> </w:t>
+      </w:r>
+      <w:proofErr w:type="spellStart"/>
+      <w:r>
+        <w:t>token</w:t>
+      </w:r>
+      <w:proofErr w:type="spellEnd"/>
+      <w:r>
+        <w:t xml:space="preserve"> segítségével hosszabbítani a session-ön, </w:t>
+      </w:r>
+      <w:proofErr w:type="gramStart"/>
+      <w:r>
+        <w:t>illetve</w:t>
+      </w:r>
+      <w:proofErr w:type="gramEnd"/>
+      <w:r>
+        <w:t xml:space="preserve"> ha nem sikerül, akkor átirányít a bejelentkező oldalra.</w:t>
       </w:r>
       <w:r>
         <w:br/>
@@ -395,7 +526,7 @@
     </w:p>
     <w:p>
       <w:pPr>
-        <w:pStyle w:val="Listaszerbekezds"/>
+        <w:pStyle w:val="ListParagraph"/>
         <w:numPr>
           <w:ilvl w:val="0"/>
           <w:numId w:val="1"/>
@@ -407,27 +538,31 @@
     </w:p>
     <w:p>
       <w:pPr>
-        <w:pStyle w:val="Listaszerbekezds"/>
+        <w:pStyle w:val="ListParagraph"/>
         <w:numPr>
           <w:ilvl w:val="0"/>
           <w:numId w:val="1"/>
         </w:numPr>
       </w:pPr>
+      <w:proofErr w:type="spellStart"/>
       <w:r>
         <w:t>Rider</w:t>
       </w:r>
-    </w:p>
-    <w:p>
-      <w:pPr>
-        <w:pStyle w:val="Listaszerbekezds"/>
+      <w:proofErr w:type="spellEnd"/>
+    </w:p>
+    <w:p>
+      <w:pPr>
+        <w:pStyle w:val="ListParagraph"/>
         <w:numPr>
           <w:ilvl w:val="0"/>
           <w:numId w:val="1"/>
         </w:numPr>
       </w:pPr>
+      <w:proofErr w:type="spellStart"/>
       <w:r>
         <w:t>DBeaver</w:t>
       </w:r>
+      <w:proofErr w:type="spellEnd"/>
     </w:p>
     <w:p/>
     <w:p>
@@ -438,43 +573,71 @@
     <w:p/>
     <w:p>
       <w:pPr>
-        <w:pStyle w:val="Listaszerbekezds"/>
+        <w:pStyle w:val="ListParagraph"/>
         <w:numPr>
           <w:ilvl w:val="0"/>
           <w:numId w:val="1"/>
         </w:numPr>
       </w:pPr>
       <w:r>
-        <w:t>Adatbázis-motor: PostgreSQL</w:t>
-      </w:r>
-    </w:p>
-    <w:p>
-      <w:pPr>
-        <w:pStyle w:val="Listaszerbekezds"/>
+        <w:t xml:space="preserve">Adatbázis-motor: </w:t>
+      </w:r>
+      <w:proofErr w:type="spellStart"/>
+      <w:r>
+        <w:t>PostgreSQL</w:t>
+      </w:r>
+      <w:proofErr w:type="spellEnd"/>
+    </w:p>
+    <w:p>
+      <w:pPr>
+        <w:pStyle w:val="ListParagraph"/>
         <w:numPr>
           <w:ilvl w:val="0"/>
           <w:numId w:val="1"/>
         </w:numPr>
       </w:pPr>
-      <w:r>
-        <w:t>User-kezelés: ASP.NET Core Identity</w:t>
-      </w:r>
-    </w:p>
-    <w:p>
-      <w:pPr>
-        <w:pStyle w:val="Listaszerbekezds"/>
+      <w:proofErr w:type="spellStart"/>
+      <w:r>
+        <w:t>User</w:t>
+      </w:r>
+      <w:proofErr w:type="spellEnd"/>
+      <w:r>
+        <w:t xml:space="preserve">-kezelés: ASP.NET </w:t>
+      </w:r>
+      <w:proofErr w:type="spellStart"/>
+      <w:r>
+        <w:t>Core</w:t>
+      </w:r>
+      <w:proofErr w:type="spellEnd"/>
+      <w:r>
+        <w:t xml:space="preserve"> </w:t>
+      </w:r>
+      <w:proofErr w:type="spellStart"/>
+      <w:r>
+        <w:t>Identity</w:t>
+      </w:r>
+      <w:proofErr w:type="spellEnd"/>
+    </w:p>
+    <w:p>
+      <w:pPr>
+        <w:pStyle w:val="ListParagraph"/>
         <w:numPr>
           <w:ilvl w:val="0"/>
           <w:numId w:val="1"/>
         </w:numPr>
       </w:pPr>
       <w:r>
-        <w:t>ORM: EF Core</w:t>
-      </w:r>
-    </w:p>
-    <w:p>
-      <w:pPr>
-        <w:pStyle w:val="Listaszerbekezds"/>
+        <w:t xml:space="preserve">ORM: EF </w:t>
+      </w:r>
+      <w:proofErr w:type="spellStart"/>
+      <w:r>
+        <w:t>Core</w:t>
+      </w:r>
+      <w:proofErr w:type="spellEnd"/>
+    </w:p>
+    <w:p>
+      <w:pPr>
+        <w:pStyle w:val="ListParagraph"/>
         <w:numPr>
           <w:ilvl w:val="0"/>
           <w:numId w:val="1"/>
@@ -486,43 +649,87 @@
     </w:p>
     <w:p>
       <w:pPr>
-        <w:pStyle w:val="Listaszerbekezds"/>
+        <w:pStyle w:val="ListParagraph"/>
         <w:numPr>
           <w:ilvl w:val="0"/>
           <w:numId w:val="1"/>
         </w:numPr>
       </w:pPr>
-      <w:r>
-        <w:t>WebAPI: ASP.NET</w:t>
-      </w:r>
-    </w:p>
-    <w:p>
-      <w:pPr>
-        <w:pStyle w:val="Listaszerbekezds"/>
+      <w:proofErr w:type="spellStart"/>
+      <w:r>
+        <w:t>WebAPI</w:t>
+      </w:r>
+      <w:proofErr w:type="spellEnd"/>
+      <w:r>
+        <w:t>: ASP.NET</w:t>
+      </w:r>
+    </w:p>
+    <w:p>
+      <w:pPr>
+        <w:pStyle w:val="ListParagraph"/>
         <w:numPr>
           <w:ilvl w:val="0"/>
           <w:numId w:val="1"/>
         </w:numPr>
       </w:pPr>
-      <w:r>
-        <w:t>Admin és szavazói felület: Blazor WebAssembly Standalone</w:t>
-      </w:r>
-    </w:p>
-    <w:p>
-      <w:pPr>
-        <w:pStyle w:val="Listaszerbekezds"/>
+      <w:proofErr w:type="spellStart"/>
+      <w:r>
+        <w:t>Admin</w:t>
+      </w:r>
+      <w:proofErr w:type="spellEnd"/>
+      <w:r>
+        <w:t xml:space="preserve"> és szavazói felület: </w:t>
+      </w:r>
+      <w:proofErr w:type="spellStart"/>
+      <w:r>
+        <w:t>Blazor</w:t>
+      </w:r>
+      <w:proofErr w:type="spellEnd"/>
+      <w:r>
+        <w:t xml:space="preserve"> </w:t>
+      </w:r>
+      <w:proofErr w:type="spellStart"/>
+      <w:r>
+        <w:t>WebAssembly</w:t>
+      </w:r>
+      <w:proofErr w:type="spellEnd"/>
+      <w:r>
+        <w:t xml:space="preserve"> </w:t>
+      </w:r>
+      <w:proofErr w:type="spellStart"/>
+      <w:r>
+        <w:t>Standalone</w:t>
+      </w:r>
+      <w:proofErr w:type="spellEnd"/>
+    </w:p>
+    <w:p>
+      <w:pPr>
+        <w:pStyle w:val="ListParagraph"/>
         <w:numPr>
           <w:ilvl w:val="0"/>
           <w:numId w:val="1"/>
         </w:numPr>
       </w:pPr>
       <w:r>
-        <w:t>Elő kétirányú kommunikáció: ASP.NET SignalR</w:t>
-      </w:r>
-    </w:p>
-    <w:p>
-      <w:pPr>
-        <w:pStyle w:val="Listaszerbekezds"/>
+        <w:t xml:space="preserve">Elő </w:t>
+      </w:r>
+      <w:proofErr w:type="spellStart"/>
+      <w:r>
+        <w:t>kétirányú</w:t>
+      </w:r>
+      <w:proofErr w:type="spellEnd"/>
+      <w:r>
+        <w:t xml:space="preserve"> kommunikáció: ASP.NET </w:t>
+      </w:r>
+      <w:proofErr w:type="spellStart"/>
+      <w:r>
+        <w:t>SignalR</w:t>
+      </w:r>
+      <w:proofErr w:type="spellEnd"/>
+    </w:p>
+    <w:p>
+      <w:pPr>
+        <w:pStyle w:val="ListParagraph"/>
         <w:numPr>
           <w:ilvl w:val="0"/>
           <w:numId w:val="1"/>
@@ -534,39 +741,99 @@
     </w:p>
     <w:p>
       <w:pPr>
-        <w:pStyle w:val="Listaszerbekezds"/>
+        <w:pStyle w:val="ListParagraph"/>
         <w:numPr>
           <w:ilvl w:val="0"/>
           <w:numId w:val="1"/>
         </w:numPr>
       </w:pPr>
-      <w:r>
-        <w:t>Nginx: docker-es kihelyezéskor a Blazor alkalmazások elérhetővé tételéhez</w:t>
-      </w:r>
-    </w:p>
-    <w:p>
-      <w:pPr>
-        <w:pStyle w:val="Listaszerbekezds"/>
+      <w:proofErr w:type="spellStart"/>
+      <w:r>
+        <w:t>Nginx</w:t>
+      </w:r>
+      <w:proofErr w:type="spellEnd"/>
+      <w:r>
+        <w:t xml:space="preserve">: </w:t>
+      </w:r>
+      <w:proofErr w:type="spellStart"/>
+      <w:r>
+        <w:t>docker</w:t>
+      </w:r>
+      <w:proofErr w:type="spellEnd"/>
+      <w:r>
+        <w:t xml:space="preserve">-es kihelyezéskor a </w:t>
+      </w:r>
+      <w:proofErr w:type="spellStart"/>
+      <w:r>
+        <w:t>Blazor</w:t>
+      </w:r>
+      <w:proofErr w:type="spellEnd"/>
+      <w:r>
+        <w:t xml:space="preserve"> alkalmazások elérhetővé tételéhez</w:t>
+      </w:r>
+    </w:p>
+    <w:p>
+      <w:pPr>
+        <w:pStyle w:val="ListParagraph"/>
         <w:numPr>
           <w:ilvl w:val="0"/>
           <w:numId w:val="1"/>
         </w:numPr>
       </w:pPr>
-      <w:r>
-        <w:t>Jenkins: automatikus tesztelés, code coverage generálás</w:t>
-      </w:r>
-    </w:p>
-    <w:p>
-      <w:pPr>
-        <w:pStyle w:val="Listaszerbekezds"/>
+      <w:proofErr w:type="spellStart"/>
+      <w:r>
+        <w:t>Jenkins</w:t>
+      </w:r>
+      <w:proofErr w:type="spellEnd"/>
+      <w:r>
+        <w:t xml:space="preserve">: automatikus tesztelés, </w:t>
+      </w:r>
+      <w:proofErr w:type="spellStart"/>
+      <w:r>
+        <w:t>code</w:t>
+      </w:r>
+      <w:proofErr w:type="spellEnd"/>
+      <w:r>
+        <w:t xml:space="preserve"> </w:t>
+      </w:r>
+      <w:proofErr w:type="spellStart"/>
+      <w:r>
+        <w:t>coverage</w:t>
+      </w:r>
+      <w:proofErr w:type="spellEnd"/>
+      <w:r>
+        <w:t xml:space="preserve"> generálás</w:t>
+      </w:r>
+    </w:p>
+    <w:p>
+      <w:pPr>
+        <w:pStyle w:val="ListParagraph"/>
         <w:numPr>
           <w:ilvl w:val="0"/>
           <w:numId w:val="1"/>
         </w:numPr>
       </w:pPr>
-      <w:r>
-        <w:t>SonarQube: code quality</w:t>
-      </w:r>
+      <w:proofErr w:type="spellStart"/>
+      <w:r>
+        <w:t>SonarQube</w:t>
+      </w:r>
+      <w:proofErr w:type="spellEnd"/>
+      <w:r>
+        <w:t xml:space="preserve">: </w:t>
+      </w:r>
+      <w:proofErr w:type="spellStart"/>
+      <w:r>
+        <w:t>code</w:t>
+      </w:r>
+      <w:proofErr w:type="spellEnd"/>
+      <w:r>
+        <w:t xml:space="preserve"> </w:t>
+      </w:r>
+      <w:proofErr w:type="spellStart"/>
+      <w:r>
+        <w:t>quality</w:t>
+      </w:r>
+      <w:proofErr w:type="spellEnd"/>
     </w:p>
     <w:p/>
     <w:p>
@@ -591,26 +858,43 @@
           <w:bCs/>
         </w:rPr>
       </w:pPr>
+      <w:proofErr w:type="spellStart"/>
       <w:r>
         <w:rPr>
           <w:b/>
           <w:bCs/>
         </w:rPr>
         <w:lastRenderedPageBreak/>
-        <w:t>Admin felület:</w:t>
-      </w:r>
-    </w:p>
-    <w:p>
-      <w:pPr>
+        <w:t>Admin</w:t>
+      </w:r>
+      <w:proofErr w:type="spellEnd"/>
+      <w:r>
         <w:rPr>
           <w:b/>
           <w:bCs/>
         </w:rPr>
-      </w:pPr>
-    </w:p>
-    <w:p>
-      <w:r>
-        <w:t>Az Admin felület feladata a két szerepkör alapján kettéválasztható. Minden felhasználó számára elérhető. A közös felületek a következők:</w:t>
+        <w:t xml:space="preserve"> felület:</w:t>
+      </w:r>
+    </w:p>
+    <w:p>
+      <w:pPr>
+        <w:rPr>
+          <w:b/>
+          <w:bCs/>
+        </w:rPr>
+      </w:pPr>
+    </w:p>
+    <w:p>
+      <w:r>
+        <w:t xml:space="preserve">Az </w:t>
+      </w:r>
+      <w:proofErr w:type="spellStart"/>
+      <w:r>
+        <w:t>Admin</w:t>
+      </w:r>
+      <w:proofErr w:type="spellEnd"/>
+      <w:r>
+        <w:t xml:space="preserve"> felület feladata a két szerepkör alapján kettéválasztható. Minden felhasználó számára elérhető. A közös felületek a következők:</w:t>
       </w:r>
     </w:p>
     <w:p/>
@@ -620,7 +904,23 @@
           <w:i/>
           <w:iCs/>
         </w:rPr>
-        <w:t>Login page: (/login)</w:t>
+        <w:t xml:space="preserve">Login </w:t>
+      </w:r>
+      <w:proofErr w:type="spellStart"/>
+      <w:r>
+        <w:rPr>
+          <w:i/>
+          <w:iCs/>
+        </w:rPr>
+        <w:t>page</w:t>
+      </w:r>
+      <w:proofErr w:type="spellEnd"/>
+      <w:r>
+        <w:rPr>
+          <w:i/>
+          <w:iCs/>
+        </w:rPr>
+        <w:t>: (/login)</w:t>
       </w:r>
       <w:r>
         <w:t>: a bejelentkezéshez használt felület. Innen elérhető az elfelejtett jelszó, illetve regisztrációs oldal is.</w:t>
@@ -628,12 +928,69 @@
     </w:p>
     <w:p/>
     <w:p>
-      <w:r>
-        <w:rPr>
-          <w:i/>
-          <w:iCs/>
-        </w:rPr>
-        <w:t>Forgot password page (/forgot-password)</w:t>
+      <w:proofErr w:type="spellStart"/>
+      <w:r>
+        <w:rPr>
+          <w:i/>
+          <w:iCs/>
+        </w:rPr>
+        <w:t>Forgot</w:t>
+      </w:r>
+      <w:proofErr w:type="spellEnd"/>
+      <w:r>
+        <w:rPr>
+          <w:i/>
+          <w:iCs/>
+        </w:rPr>
+        <w:t xml:space="preserve"> </w:t>
+      </w:r>
+      <w:proofErr w:type="spellStart"/>
+      <w:r>
+        <w:rPr>
+          <w:i/>
+          <w:iCs/>
+        </w:rPr>
+        <w:t>password</w:t>
+      </w:r>
+      <w:proofErr w:type="spellEnd"/>
+      <w:r>
+        <w:rPr>
+          <w:i/>
+          <w:iCs/>
+        </w:rPr>
+        <w:t xml:space="preserve"> </w:t>
+      </w:r>
+      <w:proofErr w:type="spellStart"/>
+      <w:r>
+        <w:rPr>
+          <w:i/>
+          <w:iCs/>
+        </w:rPr>
+        <w:t>page</w:t>
+      </w:r>
+      <w:proofErr w:type="spellEnd"/>
+      <w:r>
+        <w:rPr>
+          <w:i/>
+          <w:iCs/>
+        </w:rPr>
+        <w:t xml:space="preserve"> (/</w:t>
+      </w:r>
+      <w:proofErr w:type="spellStart"/>
+      <w:r>
+        <w:rPr>
+          <w:i/>
+          <w:iCs/>
+        </w:rPr>
+        <w:t>forgot-password</w:t>
+      </w:r>
+      <w:proofErr w:type="spellEnd"/>
+      <w:r>
+        <w:rPr>
+          <w:i/>
+          <w:iCs/>
+        </w:rPr>
+        <w:t>)</w:t>
       </w:r>
       <w:r>
         <w:t xml:space="preserve">: ha a felhasználó elfelejti jelszavát, itt kérhet </w:t>
@@ -647,12 +1004,53 @@
     </w:p>
     <w:p/>
     <w:p>
-      <w:r>
-        <w:rPr>
-          <w:i/>
-          <w:iCs/>
-        </w:rPr>
-        <w:t>Register page (/register)</w:t>
+      <w:proofErr w:type="spellStart"/>
+      <w:r>
+        <w:rPr>
+          <w:i/>
+          <w:iCs/>
+        </w:rPr>
+        <w:t>Register</w:t>
+      </w:r>
+      <w:proofErr w:type="spellEnd"/>
+      <w:r>
+        <w:rPr>
+          <w:i/>
+          <w:iCs/>
+        </w:rPr>
+        <w:t xml:space="preserve"> </w:t>
+      </w:r>
+      <w:proofErr w:type="spellStart"/>
+      <w:r>
+        <w:rPr>
+          <w:i/>
+          <w:iCs/>
+        </w:rPr>
+        <w:t>page</w:t>
+      </w:r>
+      <w:proofErr w:type="spellEnd"/>
+      <w:r>
+        <w:rPr>
+          <w:i/>
+          <w:iCs/>
+        </w:rPr>
+        <w:t xml:space="preserve"> (/</w:t>
+      </w:r>
+      <w:proofErr w:type="spellStart"/>
+      <w:r>
+        <w:rPr>
+          <w:i/>
+          <w:iCs/>
+        </w:rPr>
+        <w:t>register</w:t>
+      </w:r>
+      <w:proofErr w:type="spellEnd"/>
+      <w:r>
+        <w:rPr>
+          <w:i/>
+          <w:iCs/>
+        </w:rPr>
+        <w:t>)</w:t>
       </w:r>
       <w:r>
         <w:t>: itt lehet új felhasználóként regisztrálni az oldalra.</w:t>
@@ -660,12 +1058,69 @@
     </w:p>
     <w:p/>
     <w:p>
-      <w:r>
-        <w:rPr>
-          <w:i/>
-          <w:iCs/>
-        </w:rPr>
-        <w:t>Reset password page (/reset-password):</w:t>
+      <w:proofErr w:type="spellStart"/>
+      <w:r>
+        <w:rPr>
+          <w:i/>
+          <w:iCs/>
+        </w:rPr>
+        <w:t>Reset</w:t>
+      </w:r>
+      <w:proofErr w:type="spellEnd"/>
+      <w:r>
+        <w:rPr>
+          <w:i/>
+          <w:iCs/>
+        </w:rPr>
+        <w:t xml:space="preserve"> </w:t>
+      </w:r>
+      <w:proofErr w:type="spellStart"/>
+      <w:r>
+        <w:rPr>
+          <w:i/>
+          <w:iCs/>
+        </w:rPr>
+        <w:t>password</w:t>
+      </w:r>
+      <w:proofErr w:type="spellEnd"/>
+      <w:r>
+        <w:rPr>
+          <w:i/>
+          <w:iCs/>
+        </w:rPr>
+        <w:t xml:space="preserve"> </w:t>
+      </w:r>
+      <w:proofErr w:type="spellStart"/>
+      <w:r>
+        <w:rPr>
+          <w:i/>
+          <w:iCs/>
+        </w:rPr>
+        <w:t>page</w:t>
+      </w:r>
+      <w:proofErr w:type="spellEnd"/>
+      <w:r>
+        <w:rPr>
+          <w:i/>
+          <w:iCs/>
+        </w:rPr>
+        <w:t xml:space="preserve"> (/</w:t>
+      </w:r>
+      <w:proofErr w:type="spellStart"/>
+      <w:r>
+        <w:rPr>
+          <w:i/>
+          <w:iCs/>
+        </w:rPr>
+        <w:t>reset-password</w:t>
+      </w:r>
+      <w:proofErr w:type="spellEnd"/>
+      <w:r>
+        <w:rPr>
+          <w:i/>
+          <w:iCs/>
+        </w:rPr>
+        <w:t>):</w:t>
       </w:r>
       <w:r>
         <w:t xml:space="preserve"> a jelszó visszaállításához használt felület, az emailben küldött linkről érhető el.</w:t>
@@ -673,25 +1128,115 @@
     </w:p>
     <w:p/>
     <w:p>
-      <w:r>
-        <w:rPr>
-          <w:i/>
-          <w:iCs/>
-        </w:rPr>
-        <w:t>Confirm email page (/confirm-email):</w:t>
-      </w:r>
-      <w:r>
-        <w:t xml:space="preserve"> Az emailben küldött linkről érhető el, az oldalon található ’Confirm Email’ gomb megnyomásával erősíthető meg a felhasználó email-címe.</w:t>
+      <w:proofErr w:type="spellStart"/>
+      <w:r>
+        <w:rPr>
+          <w:i/>
+          <w:iCs/>
+        </w:rPr>
+        <w:t>Confirm</w:t>
+      </w:r>
+      <w:proofErr w:type="spellEnd"/>
+      <w:r>
+        <w:rPr>
+          <w:i/>
+          <w:iCs/>
+        </w:rPr>
+        <w:t xml:space="preserve"> email </w:t>
+      </w:r>
+      <w:proofErr w:type="spellStart"/>
+      <w:r>
+        <w:rPr>
+          <w:i/>
+          <w:iCs/>
+        </w:rPr>
+        <w:t>page</w:t>
+      </w:r>
+      <w:proofErr w:type="spellEnd"/>
+      <w:r>
+        <w:rPr>
+          <w:i/>
+          <w:iCs/>
+        </w:rPr>
+        <w:t xml:space="preserve"> (/</w:t>
+      </w:r>
+      <w:proofErr w:type="spellStart"/>
+      <w:r>
+        <w:rPr>
+          <w:i/>
+          <w:iCs/>
+        </w:rPr>
+        <w:t>confirm</w:t>
+      </w:r>
+      <w:proofErr w:type="spellEnd"/>
+      <w:r>
+        <w:rPr>
+          <w:i/>
+          <w:iCs/>
+        </w:rPr>
+        <w:t>-email):</w:t>
+      </w:r>
+      <w:r>
+        <w:t xml:space="preserve"> Az emailben küldött linkről érhető el, az oldalon található ’</w:t>
+      </w:r>
+      <w:proofErr w:type="spellStart"/>
+      <w:r>
+        <w:t>Confirm</w:t>
+      </w:r>
+      <w:proofErr w:type="spellEnd"/>
+      <w:r>
+        <w:t xml:space="preserve"> Email’ gomb megnyomásával erősíthető meg a felhasználó email-címe.</w:t>
       </w:r>
     </w:p>
     <w:p/>
     <w:p>
-      <w:r>
-        <w:rPr>
-          <w:i/>
-          <w:iCs/>
-        </w:rPr>
-        <w:t>Settings page (/settings):</w:t>
+      <w:proofErr w:type="spellStart"/>
+      <w:r>
+        <w:rPr>
+          <w:i/>
+          <w:iCs/>
+        </w:rPr>
+        <w:t>Settings</w:t>
+      </w:r>
+      <w:proofErr w:type="spellEnd"/>
+      <w:r>
+        <w:rPr>
+          <w:i/>
+          <w:iCs/>
+        </w:rPr>
+        <w:t xml:space="preserve"> </w:t>
+      </w:r>
+      <w:proofErr w:type="spellStart"/>
+      <w:r>
+        <w:rPr>
+          <w:i/>
+          <w:iCs/>
+        </w:rPr>
+        <w:t>page</w:t>
+      </w:r>
+      <w:proofErr w:type="spellEnd"/>
+      <w:r>
+        <w:rPr>
+          <w:i/>
+          <w:iCs/>
+        </w:rPr>
+        <w:t xml:space="preserve"> (/</w:t>
+      </w:r>
+      <w:proofErr w:type="spellStart"/>
+      <w:r>
+        <w:rPr>
+          <w:i/>
+          <w:iCs/>
+        </w:rPr>
+        <w:t>settings</w:t>
+      </w:r>
+      <w:proofErr w:type="spellEnd"/>
+      <w:r>
+        <w:rPr>
+          <w:i/>
+          <w:iCs/>
+        </w:rPr>
+        <w:t>):</w:t>
       </w:r>
       <w:r>
         <w:t xml:space="preserve"> a felhasználó fiókjának alapvető adatait találhatja itt, mint pl. email-cím, szerepkör. Jelszó változtatására itt van lehetőség, email-cím megerősítésére is, illetve itt lehet elfelejtett jelszó esetén jelszó visszaállító emailt kérni.</w:t>
@@ -706,7 +1251,39 @@
           <w:i/>
           <w:iCs/>
         </w:rPr>
-        <w:t>Index page (/votings):</w:t>
+        <w:t xml:space="preserve">Index </w:t>
+      </w:r>
+      <w:proofErr w:type="spellStart"/>
+      <w:r>
+        <w:rPr>
+          <w:i/>
+          <w:iCs/>
+        </w:rPr>
+        <w:t>page</w:t>
+      </w:r>
+      <w:proofErr w:type="spellEnd"/>
+      <w:r>
+        <w:rPr>
+          <w:i/>
+          <w:iCs/>
+        </w:rPr>
+        <w:t xml:space="preserve"> (/</w:t>
+      </w:r>
+      <w:proofErr w:type="spellStart"/>
+      <w:r>
+        <w:rPr>
+          <w:i/>
+          <w:iCs/>
+        </w:rPr>
+        <w:t>votings</w:t>
+      </w:r>
+      <w:proofErr w:type="spellEnd"/>
+      <w:r>
+        <w:rPr>
+          <w:i/>
+          <w:iCs/>
+        </w:rPr>
+        <w:t>):</w:t>
       </w:r>
       <w:r>
         <w:t xml:space="preserve"> itt találhatja a felhasználó az általa kiírt szavazásokat. Három részre bontható, megkezdett, jövőbeli, és lezárult szavazásokra. Itt törölni is van lehetőség a szavazatokat, illetve szerkeszteni.</w:t>
@@ -714,47 +1291,64 @@
     </w:p>
     <w:p>
       <w:pPr>
-        <w:pStyle w:val="Listaszerbekezds"/>
+        <w:pStyle w:val="ListParagraph"/>
         <w:numPr>
           <w:ilvl w:val="0"/>
           <w:numId w:val="1"/>
         </w:numPr>
       </w:pPr>
-      <w:r>
-        <w:t>Userként: csak az általa kiírt szavazások láthatóak, illetve van lehetőség törölni, szerkeszteni</w:t>
-      </w:r>
-    </w:p>
-    <w:p>
-      <w:pPr>
-        <w:pStyle w:val="Listaszerbekezds"/>
+      <w:proofErr w:type="spellStart"/>
+      <w:r>
+        <w:t>Userként</w:t>
+      </w:r>
+      <w:proofErr w:type="spellEnd"/>
+      <w:r>
+        <w:t>: csak az általa kiírt szavazások láthatóak, illetve van lehetőség törölni, szerkeszteni</w:t>
+      </w:r>
+    </w:p>
+    <w:p>
+      <w:pPr>
+        <w:pStyle w:val="ListParagraph"/>
         <w:numPr>
           <w:ilvl w:val="0"/>
           <w:numId w:val="1"/>
         </w:numPr>
       </w:pPr>
-      <w:r>
-        <w:t>Adminként: minden szavazás látható, de csak törölni van lehetőség</w:t>
+      <w:proofErr w:type="spellStart"/>
+      <w:r>
+        <w:t>Adminként</w:t>
+      </w:r>
+      <w:proofErr w:type="spellEnd"/>
+      <w:r>
+        <w:t>: minden szavazás látható, de csak törölni van lehetőség</w:t>
       </w:r>
     </w:p>
     <w:p/>
     <w:p/>
     <w:p>
       <w:r>
-        <w:t>Aki ’Admin’ szerepkört kap, annak a következő lehetőségei vannak:</w:t>
+        <w:t>Aki ’</w:t>
+      </w:r>
+      <w:proofErr w:type="spellStart"/>
+      <w:r>
+        <w:t>Admin</w:t>
+      </w:r>
+      <w:proofErr w:type="spellEnd"/>
+      <w:r>
+        <w:t>’ szerepkört kap, annak a következő lehetőségei vannak:</w:t>
       </w:r>
     </w:p>
     <w:p/>
     <w:p>
-      <w:r>
-        <w:rPr>
-          <w:i/>
-          <w:iCs/>
-        </w:rPr>
-        <w:t xml:space="preserve">Manage users page (/users): </w:t>
-      </w:r>
-      <w:r>
-        <w:t>Ezen az oldalon minden regisztrált felhasználó, és szerepköre listázásra kerül. A User-ek Admin-ná, illetve Admin-ról User-ré fel- és leléptetés érhető itt el (természetesen az Admin önmagát nem minősítheti át).</w:t>
-      </w:r>
+      <w:proofErr w:type="spellStart"/>
+      <w:r>
+        <w:rPr>
+          <w:i/>
+          <w:iCs/>
+        </w:rPr>
+        <w:t>Manage</w:t>
+      </w:r>
+      <w:proofErr w:type="spellEnd"/>
       <w:r>
         <w:rPr>
           <w:i/>
@@ -762,21 +1356,200 @@
         </w:rPr>
         <w:t xml:space="preserve"> </w:t>
       </w:r>
+      <w:proofErr w:type="spellStart"/>
+      <w:r>
+        <w:rPr>
+          <w:i/>
+          <w:iCs/>
+        </w:rPr>
+        <w:t>users</w:t>
+      </w:r>
+      <w:proofErr w:type="spellEnd"/>
+      <w:r>
+        <w:rPr>
+          <w:i/>
+          <w:iCs/>
+        </w:rPr>
+        <w:t xml:space="preserve"> </w:t>
+      </w:r>
+      <w:proofErr w:type="spellStart"/>
+      <w:r>
+        <w:rPr>
+          <w:i/>
+          <w:iCs/>
+        </w:rPr>
+        <w:t>page</w:t>
+      </w:r>
+      <w:proofErr w:type="spellEnd"/>
+      <w:r>
+        <w:rPr>
+          <w:i/>
+          <w:iCs/>
+        </w:rPr>
+        <w:t xml:space="preserve"> (/</w:t>
+      </w:r>
+      <w:proofErr w:type="spellStart"/>
+      <w:r>
+        <w:rPr>
+          <w:i/>
+          <w:iCs/>
+        </w:rPr>
+        <w:t>users</w:t>
+      </w:r>
+      <w:proofErr w:type="spellEnd"/>
+      <w:r>
+        <w:rPr>
+          <w:i/>
+          <w:iCs/>
+        </w:rPr>
+        <w:t xml:space="preserve">): </w:t>
+      </w:r>
+      <w:r>
+        <w:t xml:space="preserve">Ezen az oldalon minden regisztrált felhasználó, és szerepköre listázásra kerül. A </w:t>
+      </w:r>
+      <w:proofErr w:type="spellStart"/>
+      <w:r>
+        <w:t>User</w:t>
+      </w:r>
+      <w:proofErr w:type="spellEnd"/>
+      <w:r>
+        <w:t xml:space="preserve">-ek </w:t>
+      </w:r>
+      <w:proofErr w:type="spellStart"/>
+      <w:r>
+        <w:t>Admin-ná</w:t>
+      </w:r>
+      <w:proofErr w:type="spellEnd"/>
+      <w:r>
+        <w:t xml:space="preserve">, illetve </w:t>
+      </w:r>
+      <w:proofErr w:type="spellStart"/>
+      <w:r>
+        <w:t>Admin-ról</w:t>
+      </w:r>
+      <w:proofErr w:type="spellEnd"/>
+      <w:r>
+        <w:t xml:space="preserve"> </w:t>
+      </w:r>
+      <w:proofErr w:type="spellStart"/>
+      <w:r>
+        <w:t>User</w:t>
+      </w:r>
+      <w:proofErr w:type="spellEnd"/>
+      <w:r>
+        <w:t xml:space="preserve">-ré fel- és leléptetés érhető itt el (természetesen az </w:t>
+      </w:r>
+      <w:proofErr w:type="spellStart"/>
+      <w:r>
+        <w:t>Admin</w:t>
+      </w:r>
+      <w:proofErr w:type="spellEnd"/>
+      <w:r>
+        <w:t xml:space="preserve"> önmagát nem minősítheti át).</w:t>
+      </w:r>
+      <w:r>
+        <w:rPr>
+          <w:i/>
+          <w:iCs/>
+        </w:rPr>
+        <w:t xml:space="preserve"> </w:t>
+      </w:r>
     </w:p>
     <w:p/>
     <w:p>
       <w:r>
-        <w:t>Aki ’User’ szerepkört kap, annak a következő lehetőségei vannak:</w:t>
+        <w:t>Aki ’</w:t>
+      </w:r>
+      <w:proofErr w:type="spellStart"/>
+      <w:r>
+        <w:t>User</w:t>
+      </w:r>
+      <w:proofErr w:type="spellEnd"/>
+      <w:r>
+        <w:t>’ szerepkört kap, annak a következő lehetőségei vannak:</w:t>
       </w:r>
     </w:p>
     <w:p/>
     <w:p>
-      <w:r>
-        <w:rPr>
-          <w:i/>
-          <w:iCs/>
-        </w:rPr>
-        <w:t xml:space="preserve">Create voting page (/votings/create): </w:t>
+      <w:proofErr w:type="spellStart"/>
+      <w:r>
+        <w:rPr>
+          <w:i/>
+          <w:iCs/>
+        </w:rPr>
+        <w:t>Create</w:t>
+      </w:r>
+      <w:proofErr w:type="spellEnd"/>
+      <w:r>
+        <w:rPr>
+          <w:i/>
+          <w:iCs/>
+        </w:rPr>
+        <w:t xml:space="preserve"> </w:t>
+      </w:r>
+      <w:proofErr w:type="spellStart"/>
+      <w:r>
+        <w:rPr>
+          <w:i/>
+          <w:iCs/>
+        </w:rPr>
+        <w:t>voting</w:t>
+      </w:r>
+      <w:proofErr w:type="spellEnd"/>
+      <w:r>
+        <w:rPr>
+          <w:i/>
+          <w:iCs/>
+        </w:rPr>
+        <w:t xml:space="preserve"> </w:t>
+      </w:r>
+      <w:proofErr w:type="spellStart"/>
+      <w:r>
+        <w:rPr>
+          <w:i/>
+          <w:iCs/>
+        </w:rPr>
+        <w:t>page</w:t>
+      </w:r>
+      <w:proofErr w:type="spellEnd"/>
+      <w:r>
+        <w:rPr>
+          <w:i/>
+          <w:iCs/>
+        </w:rPr>
+        <w:t xml:space="preserve"> (/</w:t>
+      </w:r>
+      <w:proofErr w:type="spellStart"/>
+      <w:r>
+        <w:rPr>
+          <w:i/>
+          <w:iCs/>
+        </w:rPr>
+        <w:t>votings</w:t>
+      </w:r>
+      <w:proofErr w:type="spellEnd"/>
+      <w:r>
+        <w:rPr>
+          <w:i/>
+          <w:iCs/>
+        </w:rPr>
+        <w:t>/</w:t>
+      </w:r>
+      <w:proofErr w:type="spellStart"/>
+      <w:r>
+        <w:rPr>
+          <w:i/>
+          <w:iCs/>
+        </w:rPr>
+        <w:t>create</w:t>
+      </w:r>
+      <w:proofErr w:type="spellEnd"/>
+      <w:r>
+        <w:rPr>
+          <w:i/>
+          <w:iCs/>
+        </w:rPr>
+        <w:t xml:space="preserve">): </w:t>
       </w:r>
       <w:r>
         <w:t>A felhasználó itt egy nevet (nem változtatható később), illetve kezdő- és befejező időpontot megadva létrehozhat egy új szavazást, mely a szerkesztői oldalra visz azonnal.</w:t>
@@ -789,7 +1562,71 @@
           <w:i/>
           <w:iCs/>
         </w:rPr>
-        <w:t xml:space="preserve">Edit voting page (/votings/{id}): </w:t>
+        <w:t xml:space="preserve">Edit </w:t>
+      </w:r>
+      <w:proofErr w:type="spellStart"/>
+      <w:r>
+        <w:rPr>
+          <w:i/>
+          <w:iCs/>
+        </w:rPr>
+        <w:t>voting</w:t>
+      </w:r>
+      <w:proofErr w:type="spellEnd"/>
+      <w:r>
+        <w:rPr>
+          <w:i/>
+          <w:iCs/>
+        </w:rPr>
+        <w:t xml:space="preserve"> </w:t>
+      </w:r>
+      <w:proofErr w:type="spellStart"/>
+      <w:r>
+        <w:rPr>
+          <w:i/>
+          <w:iCs/>
+        </w:rPr>
+        <w:t>page</w:t>
+      </w:r>
+      <w:proofErr w:type="spellEnd"/>
+      <w:r>
+        <w:rPr>
+          <w:i/>
+          <w:iCs/>
+        </w:rPr>
+        <w:t xml:space="preserve"> (/</w:t>
+      </w:r>
+      <w:proofErr w:type="spellStart"/>
+      <w:r>
+        <w:rPr>
+          <w:i/>
+          <w:iCs/>
+        </w:rPr>
+        <w:t>votings</w:t>
+      </w:r>
+      <w:proofErr w:type="spellEnd"/>
+      <w:r>
+        <w:rPr>
+          <w:i/>
+          <w:iCs/>
+        </w:rPr>
+        <w:t>/{</w:t>
+      </w:r>
+      <w:proofErr w:type="spellStart"/>
+      <w:r>
+        <w:rPr>
+          <w:i/>
+          <w:iCs/>
+        </w:rPr>
+        <w:t>id</w:t>
+      </w:r>
+      <w:proofErr w:type="spellEnd"/>
+      <w:r>
+        <w:rPr>
+          <w:i/>
+          <w:iCs/>
+        </w:rPr>
+        <w:t xml:space="preserve">}): </w:t>
       </w:r>
       <w:r>
         <w:t xml:space="preserve">Itt lehet a szavazás kezdő- és végpontját, illetve az elérhető szavazati opciókat szerkeszteni, valamint a szavazást elindítani. Egy szavazás akkor indítható el, ha van legalább 2 elérhető választási lehetőség. Ha ez teljesül, akkor </w:t>
@@ -825,7 +1662,23 @@
     <w:p/>
     <w:p>
       <w:r>
-        <w:t>A szavazói felület Admin felhasználók számára nem érhető el, ők átirányítást kapnak az Admin felületre bejelentkezéskor. A szavazói felület feladat a szavazatok leadása, illetve a leadott szavazatok megtekintése. Három felület elérhető:</w:t>
+        <w:t xml:space="preserve">A szavazói felület </w:t>
+      </w:r>
+      <w:proofErr w:type="spellStart"/>
+      <w:r>
+        <w:t>Admin</w:t>
+      </w:r>
+      <w:proofErr w:type="spellEnd"/>
+      <w:r>
+        <w:t xml:space="preserve"> felhasználók számára nem érhető el, ők átirányítást kapnak az </w:t>
+      </w:r>
+      <w:proofErr w:type="spellStart"/>
+      <w:r>
+        <w:t>Admin</w:t>
+      </w:r>
+      <w:proofErr w:type="spellEnd"/>
+      <w:r>
+        <w:t xml:space="preserve"> felületre bejelentkezéskor. A szavazói felület feladat a szavazatok leadása, illetve a leadott szavazatok megtekintése. Három felület elérhető:</w:t>
       </w:r>
       <w:r>
         <w:br/>
@@ -838,7 +1691,39 @@
           <w:i/>
           <w:iCs/>
         </w:rPr>
-        <w:t xml:space="preserve">Index page (/home): </w:t>
+        <w:t xml:space="preserve">Index </w:t>
+      </w:r>
+      <w:proofErr w:type="spellStart"/>
+      <w:r>
+        <w:rPr>
+          <w:i/>
+          <w:iCs/>
+        </w:rPr>
+        <w:t>page</w:t>
+      </w:r>
+      <w:proofErr w:type="spellEnd"/>
+      <w:r>
+        <w:rPr>
+          <w:i/>
+          <w:iCs/>
+        </w:rPr>
+        <w:t xml:space="preserve"> (/</w:t>
+      </w:r>
+      <w:proofErr w:type="spellStart"/>
+      <w:r>
+        <w:rPr>
+          <w:i/>
+          <w:iCs/>
+        </w:rPr>
+        <w:t>home</w:t>
+      </w:r>
+      <w:proofErr w:type="spellEnd"/>
+      <w:r>
+        <w:rPr>
+          <w:i/>
+          <w:iCs/>
+        </w:rPr>
+        <w:t xml:space="preserve">): </w:t>
       </w:r>
       <w:r>
         <w:t>A felhasználó itt találja a számára elérhető szavazásokat. Ha az egyikre rákattint, akkor a szavazói oldalra kerül.</w:t>
@@ -846,12 +1731,69 @@
     </w:p>
     <w:p/>
     <w:p>
-      <w:r>
-        <w:rPr>
-          <w:i/>
-          <w:iCs/>
-        </w:rPr>
-        <w:t xml:space="preserve">Vote page (/voting/{id}): </w:t>
+      <w:proofErr w:type="spellStart"/>
+      <w:r>
+        <w:rPr>
+          <w:i/>
+          <w:iCs/>
+        </w:rPr>
+        <w:t>Vote</w:t>
+      </w:r>
+      <w:proofErr w:type="spellEnd"/>
+      <w:r>
+        <w:rPr>
+          <w:i/>
+          <w:iCs/>
+        </w:rPr>
+        <w:t xml:space="preserve"> </w:t>
+      </w:r>
+      <w:proofErr w:type="spellStart"/>
+      <w:r>
+        <w:rPr>
+          <w:i/>
+          <w:iCs/>
+        </w:rPr>
+        <w:t>page</w:t>
+      </w:r>
+      <w:proofErr w:type="spellEnd"/>
+      <w:r>
+        <w:rPr>
+          <w:i/>
+          <w:iCs/>
+        </w:rPr>
+        <w:t xml:space="preserve"> (/</w:t>
+      </w:r>
+      <w:proofErr w:type="spellStart"/>
+      <w:r>
+        <w:rPr>
+          <w:i/>
+          <w:iCs/>
+        </w:rPr>
+        <w:t>voting</w:t>
+      </w:r>
+      <w:proofErr w:type="spellEnd"/>
+      <w:r>
+        <w:rPr>
+          <w:i/>
+          <w:iCs/>
+        </w:rPr>
+        <w:t>/{</w:t>
+      </w:r>
+      <w:proofErr w:type="spellStart"/>
+      <w:r>
+        <w:rPr>
+          <w:i/>
+          <w:iCs/>
+        </w:rPr>
+        <w:t>id</w:t>
+      </w:r>
+      <w:proofErr w:type="spellEnd"/>
+      <w:r>
+        <w:rPr>
+          <w:i/>
+          <w:iCs/>
+        </w:rPr>
+        <w:t xml:space="preserve">}): </w:t>
       </w:r>
       <w:r>
         <w:t>Itt van lehetőség a megadott lehetőségek egyikére szavazni. A szavazat nem visszavonható, amiről a felhasználó szavazás előtt tájékoztatást is kap.</w:t>
@@ -865,12 +1807,53 @@
           <w:bCs/>
         </w:rPr>
       </w:pPr>
-      <w:r>
-        <w:rPr>
-          <w:i/>
-          <w:iCs/>
-        </w:rPr>
-        <w:t xml:space="preserve">History page (/history): </w:t>
+      <w:proofErr w:type="spellStart"/>
+      <w:r>
+        <w:rPr>
+          <w:i/>
+          <w:iCs/>
+        </w:rPr>
+        <w:t>History</w:t>
+      </w:r>
+      <w:proofErr w:type="spellEnd"/>
+      <w:r>
+        <w:rPr>
+          <w:i/>
+          <w:iCs/>
+        </w:rPr>
+        <w:t xml:space="preserve"> </w:t>
+      </w:r>
+      <w:proofErr w:type="spellStart"/>
+      <w:r>
+        <w:rPr>
+          <w:i/>
+          <w:iCs/>
+        </w:rPr>
+        <w:t>page</w:t>
+      </w:r>
+      <w:proofErr w:type="spellEnd"/>
+      <w:r>
+        <w:rPr>
+          <w:i/>
+          <w:iCs/>
+        </w:rPr>
+        <w:t xml:space="preserve"> (/</w:t>
+      </w:r>
+      <w:proofErr w:type="spellStart"/>
+      <w:r>
+        <w:rPr>
+          <w:i/>
+          <w:iCs/>
+        </w:rPr>
+        <w:t>history</w:t>
+      </w:r>
+      <w:proofErr w:type="spellEnd"/>
+      <w:r>
+        <w:rPr>
+          <w:i/>
+          <w:iCs/>
+        </w:rPr>
+        <w:t xml:space="preserve">): </w:t>
       </w:r>
       <w:r>
         <w:t>Itt találja a felhasználó a már leadott szavazatait. Látja a választott opciót, illetve a szavazati arányokat is, amely élőben is frissül.</w:t>
@@ -899,7 +1882,31 @@
     </w:p>
     <w:p>
       <w:r>
-        <w:t>A rendszer statikus tervezete a docs/ mappában található. Elérhető az adatbázis séma (db_schema.png), valamint UML diagramok (puml/) illetve komponens diagram (puml/</w:t>
+        <w:t xml:space="preserve">A rendszer statikus tervezete a </w:t>
+      </w:r>
+      <w:proofErr w:type="spellStart"/>
+      <w:r>
+        <w:t>docs</w:t>
+      </w:r>
+      <w:proofErr w:type="spellEnd"/>
+      <w:r>
+        <w:t>/ mappában található. Elérhető az adatbázis séma (db_schema.png), valamint UML diagramok (</w:t>
+      </w:r>
+      <w:proofErr w:type="spellStart"/>
+      <w:r>
+        <w:t>puml</w:t>
+      </w:r>
+      <w:proofErr w:type="spellEnd"/>
+      <w:r>
+        <w:t>/) illetve komponens diagram (</w:t>
+      </w:r>
+      <w:proofErr w:type="spellStart"/>
+      <w:r>
+        <w:t>puml</w:t>
+      </w:r>
+      <w:proofErr w:type="spellEnd"/>
+      <w:r>
+        <w:t>/</w:t>
       </w:r>
       <w:r>
         <w:t xml:space="preserve"> components</w:t>
@@ -934,32 +1941,114 @@
     </w:p>
     <w:p>
       <w:r>
-        <w:t>A rendszer tesztelése alapos, több rétegben történik. Az első tesztelési folyamat a DataAccess réteg tesztelése, mely a VoterSystem.Tests.Unit projekten belül történik. Itt teszteljük az összes, alapfeladat részét képző Service osztályt (kivétel: EmailService), és biztosítjuk a működésüket.</w:t>
+        <w:t xml:space="preserve">A rendszer tesztelése alapos, több rétegben történik. Az első tesztelési folyamat a DataAccess réteg tesztelése, mely a </w:t>
+      </w:r>
+      <w:proofErr w:type="spellStart"/>
+      <w:proofErr w:type="gramStart"/>
+      <w:r>
+        <w:t>VoterSystem.Tests.Unit</w:t>
+      </w:r>
+      <w:proofErr w:type="spellEnd"/>
+      <w:proofErr w:type="gramEnd"/>
+      <w:r>
+        <w:t xml:space="preserve"> projekten belül történik. Itt teszteljük az összes, alapfeladat részét képző Service osztályt (kivétel: </w:t>
+      </w:r>
+      <w:proofErr w:type="spellStart"/>
+      <w:r>
+        <w:t>EmailService</w:t>
+      </w:r>
+      <w:proofErr w:type="spellEnd"/>
+      <w:r>
+        <w:t>), és biztosítjuk a működésüket.</w:t>
       </w:r>
     </w:p>
     <w:p/>
     <w:p>
       <w:r>
-        <w:t>A következő réteg a web API tesztelése, mely integrációs tesztekkel, konténerben elhelyezett teszt-adatbázissal történik, HTTP hívásokon keresztül. Itt azt teszteljük, hogy a megfelelő végpontok hívása megfelelő státusz kódot eredményez-e, hiszen a unit tesztekben már tesztelésre került az elvárt hatás. Itt történik továbbá a SignalR tesztelése, melyhez csak bejelentkezve férünk hozzá, és teszteljük, hogy a szavazati eredmények frissülését megkapja-e az, akinek joga van hozzá.</w:t>
+        <w:t xml:space="preserve">A következő réteg a web API tesztelése, mely integrációs tesztekkel, konténerben elhelyezett teszt-adatbázissal történik, HTTP hívásokon keresztül. Itt azt teszteljük, hogy a megfelelő végpontok hívása megfelelő státusz kódot eredményez-e, hiszen </w:t>
+      </w:r>
+      <w:proofErr w:type="gramStart"/>
+      <w:r>
+        <w:t>a</w:t>
+      </w:r>
+      <w:proofErr w:type="gramEnd"/>
+      <w:r>
+        <w:t xml:space="preserve"> unit tesztekben már tesztelésre került az elvárt hatás. Itt történik továbbá a </w:t>
+      </w:r>
+      <w:proofErr w:type="spellStart"/>
+      <w:r>
+        <w:t>SignalR</w:t>
+      </w:r>
+      <w:proofErr w:type="spellEnd"/>
+      <w:r>
+        <w:t xml:space="preserve"> tesztelése, melyhez csak bejelentkezve férünk hozzá, és teszteljük, hogy a szavazati eredmények frissülését megkapja-e az, akinek joga van hozzá.</w:t>
       </w:r>
     </w:p>
     <w:p/>
     <w:p>
       <w:r>
-        <w:t>A legutolsó réteg az admin felület felülettesztelése, mely a bUnit keretrendszerrel komponens tesztekkel történik. Itt azt ellenőrizzük, hogy a felületen megjelenő komponensek ténylegesen elérhetőek, illetve több helyen különböző felhasználói interakciót is szimulálunk.</w:t>
+        <w:t xml:space="preserve">A legutolsó réteg az </w:t>
+      </w:r>
+      <w:proofErr w:type="spellStart"/>
+      <w:r>
+        <w:t>admin</w:t>
+      </w:r>
+      <w:proofErr w:type="spellEnd"/>
+      <w:r>
+        <w:t xml:space="preserve"> felület felülettesztelése, mely a </w:t>
+      </w:r>
+      <w:proofErr w:type="spellStart"/>
+      <w:r>
+        <w:t>bUnit</w:t>
+      </w:r>
+      <w:proofErr w:type="spellEnd"/>
+      <w:r>
+        <w:t xml:space="preserve"> keretrendszerrel komponens tesztekkel történik. Itt azt ellenőrizzük, hogy a felületen megjelenő komponensek ténylegesen elérhetőek, illetve több helyen különböző felhasználói interakciót is szimulálunk.</w:t>
       </w:r>
     </w:p>
     <w:p/>
     <w:p>
       <w:r>
-        <w:t>A tesztek futtahatóak bárhol, viszont az integrációs tesztek csak a háttérben futó Docker Engine jelenlétében futtahatóak a Postgres konténer miatt.</w:t>
+        <w:t xml:space="preserve">A tesztek futtahatóak bárhol, viszont az integrációs tesztek csak a háttérben futó Docker </w:t>
+      </w:r>
+      <w:proofErr w:type="spellStart"/>
+      <w:r>
+        <w:t>Engine</w:t>
+      </w:r>
+      <w:proofErr w:type="spellEnd"/>
+      <w:r>
+        <w:t xml:space="preserve"> jelenlétében futtahatóak a </w:t>
+      </w:r>
+      <w:proofErr w:type="spellStart"/>
+      <w:r>
+        <w:t>Postgres</w:t>
+      </w:r>
+      <w:proofErr w:type="spellEnd"/>
+      <w:r>
+        <w:t xml:space="preserve"> konténer miatt.</w:t>
       </w:r>
     </w:p>
     <w:p/>
     <w:p>
       <w:r>
         <w:lastRenderedPageBreak/>
-        <w:t>A manuális tesztelést elősegíti a DataAccess rétegbe beépített DbInitializer osztály, melynek segítségével az adatbázisban elhelyezünk felhasználókat, szavazásokat, szavazatokat, és szavazati opciókat is, így könnyedén ellenőrizhetőek a különböző szituációk. Emellett elérhető a web API-hoz egy Swagger UI oldal, aminek segítségével célirányosan a végpontok is könnyen tesztelhetővé válnak.</w:t>
+        <w:t xml:space="preserve">A manuális tesztelést elősegíti a DataAccess rétegbe beépített </w:t>
+      </w:r>
+      <w:proofErr w:type="spellStart"/>
+      <w:r>
+        <w:t>DbInitializer</w:t>
+      </w:r>
+      <w:proofErr w:type="spellEnd"/>
+      <w:r>
+        <w:t xml:space="preserve"> osztály, melynek segítségével az adatbázisban elhelyezünk felhasználókat, szavazásokat, szavazatokat, és szavazati opciókat is, így könnyedén ellenőrizhetőek a különböző szituációk. Emellett elérhető a web API-hoz egy </w:t>
+      </w:r>
+      <w:proofErr w:type="spellStart"/>
+      <w:r>
+        <w:t>Swagger</w:t>
+      </w:r>
+      <w:proofErr w:type="spellEnd"/>
+      <w:r>
+        <w:t xml:space="preserve"> UI oldal, aminek segítségével célirányosan a végpontok is könnyen tesztelhetővé válnak.</w:t>
       </w:r>
     </w:p>
     <w:p>
@@ -994,31 +2083,100 @@
     <w:p/>
     <w:p>
       <w:pPr>
-        <w:pStyle w:val="Listaszerbekezds"/>
+        <w:pStyle w:val="ListParagraph"/>
         <w:numPr>
           <w:ilvl w:val="0"/>
           <w:numId w:val="1"/>
         </w:numPr>
       </w:pPr>
       <w:r>
-        <w:t>Helyi futtatás, Windows: A helyi futtatás esetén az adatbázis, illetve a különböző környezeti változók elérhetőségét kell biztosítani. Technikai okokból Windows-on nem működik a Postgres adatbázist elkészítő docker-compose fájl, így manuálisan kell ezt telepíteni a gépünkre. Ezután a WebAPI projekt UserSecrets fájljában kell definiálni a VoterSystem.Shared.DotEnv.DotEnvConfigEntry-ből készített listában a különböző környezeti változók neveit és értékeit (lásd: .env.example). Ezután a program futtatható.</w:t>
-      </w:r>
-    </w:p>
-    <w:p>
-      <w:pPr>
-        <w:pStyle w:val="Listaszerbekezds"/>
+        <w:t>Helyi futtatás, Windows: A helyi futtatás esetén az adatbázis, illetve a különböző környezeti változók elérhetőségét kell biztosítani. Technikai okokból Windows-</w:t>
+      </w:r>
+      <w:proofErr w:type="spellStart"/>
+      <w:r>
+        <w:t>on</w:t>
+      </w:r>
+      <w:proofErr w:type="spellEnd"/>
+      <w:r>
+        <w:t xml:space="preserve"> nem működik a </w:t>
+      </w:r>
+      <w:proofErr w:type="spellStart"/>
+      <w:r>
+        <w:t>Postgres</w:t>
+      </w:r>
+      <w:proofErr w:type="spellEnd"/>
+      <w:r>
+        <w:t xml:space="preserve"> adatbázist elkészítő </w:t>
+      </w:r>
+      <w:proofErr w:type="spellStart"/>
+      <w:r>
+        <w:t>docker-compose</w:t>
+      </w:r>
+      <w:proofErr w:type="spellEnd"/>
+      <w:r>
+        <w:t xml:space="preserve"> fájl, így manuálisan kell ezt telepíteni a gépünkre. Ezután a </w:t>
+      </w:r>
+      <w:proofErr w:type="spellStart"/>
+      <w:r>
+        <w:t>WebAPI</w:t>
+      </w:r>
+      <w:proofErr w:type="spellEnd"/>
+      <w:r>
+        <w:t xml:space="preserve"> projekt </w:t>
+      </w:r>
+      <w:proofErr w:type="spellStart"/>
+      <w:r>
+        <w:t>UserSecrets</w:t>
+      </w:r>
+      <w:proofErr w:type="spellEnd"/>
+      <w:r>
+        <w:t xml:space="preserve"> fájljában kell definiálni a </w:t>
+      </w:r>
+      <w:proofErr w:type="spellStart"/>
+      <w:proofErr w:type="gramStart"/>
+      <w:r>
+        <w:t>VoterSystem.Shared.DotEnv.DotEnvConfigEntry</w:t>
+      </w:r>
+      <w:proofErr w:type="gramEnd"/>
+      <w:r>
+        <w:t>-ből</w:t>
+      </w:r>
+      <w:proofErr w:type="spellEnd"/>
+      <w:r>
+        <w:t xml:space="preserve"> készített listában a különböző környezeti változók neveit és értékeit (lásd: .</w:t>
+      </w:r>
+      <w:proofErr w:type="spellStart"/>
+      <w:r>
+        <w:t>env.example</w:t>
+      </w:r>
+      <w:proofErr w:type="spellEnd"/>
+      <w:r>
+        <w:t>). Ezután a program futtatható.</w:t>
+      </w:r>
+    </w:p>
+    <w:p>
+      <w:pPr>
+        <w:pStyle w:val="ListParagraph"/>
         <w:numPr>
           <w:ilvl w:val="0"/>
           <w:numId w:val="1"/>
         </w:numPr>
       </w:pPr>
       <w:r>
-        <w:t>Helyi futtatás, más platformon: Megegyezik a Windows-os futtatással, viszont itt használható a docker-compose-db.yml fájl, így az adatbázist érdemes Docker segítségével létrehozni.</w:t>
-      </w:r>
-    </w:p>
-    <w:p>
-      <w:pPr>
-        <w:pStyle w:val="Listaszerbekezds"/>
+        <w:t xml:space="preserve">Helyi futtatás, más platformon: Megegyezik a Windows-os futtatással, viszont itt használható a </w:t>
+      </w:r>
+      <w:proofErr w:type="spellStart"/>
+      <w:r>
+        <w:t>docker-compose-db.yml</w:t>
+      </w:r>
+      <w:proofErr w:type="spellEnd"/>
+      <w:r>
+        <w:t xml:space="preserve"> fájl, így az adatbázist érdemes Docker segítségével létrehozni.</w:t>
+      </w:r>
+    </w:p>
+    <w:p>
+      <w:pPr>
+        <w:pStyle w:val="ListParagraph"/>
         <w:numPr>
           <w:ilvl w:val="0"/>
           <w:numId w:val="1"/>
@@ -1031,12 +2189,97 @@
         <w:t>ik jelenleg</w:t>
       </w:r>
       <w:r>
-        <w:t>): ez a kihelyezés csak tervben van, a könnyebb tesztelés érdekében, viszont ha  .env.example fájl értékeit áthelyezzük és felülírjuk egy .env fájlba, akkor a docker-compose.yml segítségével rögtön kihelyezhető bármilyen szerverre a teljes szolgáltatás, és használható.</w:t>
+        <w:t xml:space="preserve">): ez a kihelyezés csak tervben van, a könnyebb tesztelés érdekében, viszont </w:t>
+      </w:r>
+      <w:proofErr w:type="gramStart"/>
+      <w:r>
+        <w:t>ha  .</w:t>
+      </w:r>
+      <w:proofErr w:type="spellStart"/>
+      <w:proofErr w:type="gramEnd"/>
+      <w:r>
+        <w:t>env.example</w:t>
+      </w:r>
+      <w:proofErr w:type="spellEnd"/>
+      <w:r>
+        <w:t xml:space="preserve"> fájl értékeit áthelyezzük és felülírjuk egy .</w:t>
+      </w:r>
+      <w:proofErr w:type="spellStart"/>
+      <w:r>
+        <w:t>env</w:t>
+      </w:r>
+      <w:proofErr w:type="spellEnd"/>
+      <w:r>
+        <w:t xml:space="preserve"> fájlba, akkor a </w:t>
+      </w:r>
+      <w:proofErr w:type="spellStart"/>
+      <w:r>
+        <w:t>docker-compose.yml</w:t>
+      </w:r>
+      <w:proofErr w:type="spellEnd"/>
+      <w:r>
+        <w:t xml:space="preserve"> segítségével rögtön kihelyezhető bármilyen szerverre a teljes szolgáltatás, és használható.</w:t>
       </w:r>
       <w:r>
         <w:t xml:space="preserve"> Ez a módszer az idő szűkössége miatt nem készült el, viszont későbbi fejlesztéseket megkönnyítene.</w:t>
       </w:r>
-    </w:p>
+      <w:r>
+        <w:br/>
+      </w:r>
+      <w:r>
+        <w:br/>
+      </w:r>
+    </w:p>
+    <w:p>
+      <w:r>
+        <w:t>Tesztelhető a következő URL-</w:t>
+      </w:r>
+      <w:proofErr w:type="spellStart"/>
+      <w:r>
+        <w:t>eken</w:t>
+      </w:r>
+      <w:proofErr w:type="spellEnd"/>
+      <w:r>
+        <w:t>:</w:t>
+      </w:r>
+      <w:r>
+        <w:br/>
+      </w:r>
+      <w:r>
+        <w:br/>
+      </w:r>
+      <w:hyperlink r:id="rId5" w:history="1">
+        <w:r>
+          <w:rPr>
+            <w:rStyle w:val="Hyperlink"/>
+          </w:rPr>
+          <w:t>https://adm</w:t>
+        </w:r>
+        <w:r>
+          <w:rPr>
+            <w:rStyle w:val="Hyperlink"/>
+          </w:rPr>
+          <w:t>i</w:t>
+        </w:r>
+        <w:r>
+          <w:rPr>
+            <w:rStyle w:val="Hyperlink"/>
+          </w:rPr>
+          <w:t>n.andris.picidolgok.hu</w:t>
+        </w:r>
+      </w:hyperlink>
+    </w:p>
+    <w:p>
+      <w:hyperlink r:id="rId6" w:history="1">
+        <w:r>
+          <w:rPr>
+            <w:rStyle w:val="Hyperlink"/>
+          </w:rPr>
+          <w:t>https://web.andris.picidolgok.hu</w:t>
+        </w:r>
+      </w:hyperlink>
+    </w:p>
+    <w:p/>
     <w:sectPr>
       <w:pgSz w:w="11906" w:h="16838"/>
       <w:pgMar w:top="1440" w:right="1440" w:bottom="1440" w:left="1440" w:header="708" w:footer="708" w:gutter="0"/>
@@ -1560,15 +2803,15 @@
     <w:lsdException w:name="Unresolved Mention" w:semiHidden="1" w:unhideWhenUsed="1"/>
     <w:lsdException w:name="Smart Link" w:semiHidden="1" w:unhideWhenUsed="1"/>
   </w:latentStyles>
-  <w:style w:type="paragraph" w:default="1" w:styleId="Norml">
+  <w:style w:type="paragraph" w:default="1" w:styleId="Normal">
     <w:name w:val="Normal"/>
     <w:qFormat/>
   </w:style>
-  <w:style w:type="paragraph" w:styleId="Cmsor1">
+  <w:style w:type="paragraph" w:styleId="Heading1">
     <w:name w:val="heading 1"/>
-    <w:basedOn w:val="Norml"/>
-    <w:next w:val="Norml"/>
-    <w:link w:val="Cmsor1Char"/>
+    <w:basedOn w:val="Normal"/>
+    <w:next w:val="Normal"/>
+    <w:link w:val="Heading1Char"/>
     <w:uiPriority w:val="9"/>
     <w:qFormat/>
     <w:rsid w:val="00157665"/>
@@ -1585,11 +2828,11 @@
       <w:szCs w:val="40"/>
     </w:rPr>
   </w:style>
-  <w:style w:type="paragraph" w:styleId="Cmsor2">
+  <w:style w:type="paragraph" w:styleId="Heading2">
     <w:name w:val="heading 2"/>
-    <w:basedOn w:val="Norml"/>
-    <w:next w:val="Norml"/>
-    <w:link w:val="Cmsor2Char"/>
+    <w:basedOn w:val="Normal"/>
+    <w:next w:val="Normal"/>
+    <w:link w:val="Heading2Char"/>
     <w:uiPriority w:val="9"/>
     <w:semiHidden/>
     <w:unhideWhenUsed/>
@@ -1608,11 +2851,11 @@
       <w:szCs w:val="32"/>
     </w:rPr>
   </w:style>
-  <w:style w:type="paragraph" w:styleId="Cmsor3">
+  <w:style w:type="paragraph" w:styleId="Heading3">
     <w:name w:val="heading 3"/>
-    <w:basedOn w:val="Norml"/>
-    <w:next w:val="Norml"/>
-    <w:link w:val="Cmsor3Char"/>
+    <w:basedOn w:val="Normal"/>
+    <w:next w:val="Normal"/>
+    <w:link w:val="Heading3Char"/>
     <w:uiPriority w:val="9"/>
     <w:semiHidden/>
     <w:unhideWhenUsed/>
@@ -1631,11 +2874,11 @@
       <w:szCs w:val="28"/>
     </w:rPr>
   </w:style>
-  <w:style w:type="paragraph" w:styleId="Cmsor4">
+  <w:style w:type="paragraph" w:styleId="Heading4">
     <w:name w:val="heading 4"/>
-    <w:basedOn w:val="Norml"/>
-    <w:next w:val="Norml"/>
-    <w:link w:val="Cmsor4Char"/>
+    <w:basedOn w:val="Normal"/>
+    <w:next w:val="Normal"/>
+    <w:link w:val="Heading4Char"/>
     <w:uiPriority w:val="9"/>
     <w:semiHidden/>
     <w:unhideWhenUsed/>
@@ -1654,11 +2897,11 @@
       <w:color w:val="0F4761" w:themeColor="accent1" w:themeShade="BF"/>
     </w:rPr>
   </w:style>
-  <w:style w:type="paragraph" w:styleId="Cmsor5">
+  <w:style w:type="paragraph" w:styleId="Heading5">
     <w:name w:val="heading 5"/>
-    <w:basedOn w:val="Norml"/>
-    <w:next w:val="Norml"/>
-    <w:link w:val="Cmsor5Char"/>
+    <w:basedOn w:val="Normal"/>
+    <w:next w:val="Normal"/>
+    <w:link w:val="Heading5Char"/>
     <w:uiPriority w:val="9"/>
     <w:semiHidden/>
     <w:unhideWhenUsed/>
@@ -1675,11 +2918,11 @@
       <w:color w:val="0F4761" w:themeColor="accent1" w:themeShade="BF"/>
     </w:rPr>
   </w:style>
-  <w:style w:type="paragraph" w:styleId="Cmsor6">
+  <w:style w:type="paragraph" w:styleId="Heading6">
     <w:name w:val="heading 6"/>
-    <w:basedOn w:val="Norml"/>
-    <w:next w:val="Norml"/>
-    <w:link w:val="Cmsor6Char"/>
+    <w:basedOn w:val="Normal"/>
+    <w:next w:val="Normal"/>
+    <w:link w:val="Heading6Char"/>
     <w:uiPriority w:val="9"/>
     <w:semiHidden/>
     <w:unhideWhenUsed/>
@@ -1698,11 +2941,11 @@
       <w:color w:val="595959" w:themeColor="text1" w:themeTint="A6"/>
     </w:rPr>
   </w:style>
-  <w:style w:type="paragraph" w:styleId="Cmsor7">
+  <w:style w:type="paragraph" w:styleId="Heading7">
     <w:name w:val="heading 7"/>
-    <w:basedOn w:val="Norml"/>
-    <w:next w:val="Norml"/>
-    <w:link w:val="Cmsor7Char"/>
+    <w:basedOn w:val="Normal"/>
+    <w:next w:val="Normal"/>
+    <w:link w:val="Heading7Char"/>
     <w:uiPriority w:val="9"/>
     <w:semiHidden/>
     <w:unhideWhenUsed/>
@@ -1719,11 +2962,11 @@
       <w:color w:val="595959" w:themeColor="text1" w:themeTint="A6"/>
     </w:rPr>
   </w:style>
-  <w:style w:type="paragraph" w:styleId="Cmsor8">
+  <w:style w:type="paragraph" w:styleId="Heading8">
     <w:name w:val="heading 8"/>
-    <w:basedOn w:val="Norml"/>
-    <w:next w:val="Norml"/>
-    <w:link w:val="Cmsor8Char"/>
+    <w:basedOn w:val="Normal"/>
+    <w:next w:val="Normal"/>
+    <w:link w:val="Heading8Char"/>
     <w:uiPriority w:val="9"/>
     <w:semiHidden/>
     <w:unhideWhenUsed/>
@@ -1741,11 +2984,11 @@
       <w:color w:val="272727" w:themeColor="text1" w:themeTint="D8"/>
     </w:rPr>
   </w:style>
-  <w:style w:type="paragraph" w:styleId="Cmsor9">
+  <w:style w:type="paragraph" w:styleId="Heading9">
     <w:name w:val="heading 9"/>
-    <w:basedOn w:val="Norml"/>
-    <w:next w:val="Norml"/>
-    <w:link w:val="Cmsor9Char"/>
+    <w:basedOn w:val="Normal"/>
+    <w:next w:val="Normal"/>
+    <w:link w:val="Heading9Char"/>
     <w:uiPriority w:val="9"/>
     <w:semiHidden/>
     <w:unhideWhenUsed/>
@@ -1761,13 +3004,13 @@
       <w:color w:val="272727" w:themeColor="text1" w:themeTint="D8"/>
     </w:rPr>
   </w:style>
-  <w:style w:type="character" w:default="1" w:styleId="Bekezdsalapbettpusa">
+  <w:style w:type="character" w:default="1" w:styleId="DefaultParagraphFont">
     <w:name w:val="Default Paragraph Font"/>
     <w:uiPriority w:val="1"/>
     <w:semiHidden/>
     <w:unhideWhenUsed/>
   </w:style>
-  <w:style w:type="table" w:default="1" w:styleId="Normltblzat">
+  <w:style w:type="table" w:default="1" w:styleId="TableNormal">
     <w:name w:val="Normal Table"/>
     <w:uiPriority w:val="99"/>
     <w:semiHidden/>
@@ -1782,16 +3025,16 @@
       </w:tblCellMar>
     </w:tblPr>
   </w:style>
-  <w:style w:type="numbering" w:default="1" w:styleId="Nemlista">
+  <w:style w:type="numbering" w:default="1" w:styleId="NoList">
     <w:name w:val="No List"/>
     <w:uiPriority w:val="99"/>
     <w:semiHidden/>
     <w:unhideWhenUsed/>
   </w:style>
-  <w:style w:type="character" w:customStyle="1" w:styleId="Cmsor1Char">
-    <w:name w:val="Címsor 1 Char"/>
-    <w:basedOn w:val="Bekezdsalapbettpusa"/>
-    <w:link w:val="Cmsor1"/>
+  <w:style w:type="character" w:customStyle="1" w:styleId="Heading1Char">
+    <w:name w:val="Heading 1 Char"/>
+    <w:basedOn w:val="DefaultParagraphFont"/>
+    <w:link w:val="Heading1"/>
     <w:uiPriority w:val="9"/>
     <w:rsid w:val="00157665"/>
     <w:rPr>
@@ -1801,10 +3044,10 @@
       <w:szCs w:val="40"/>
     </w:rPr>
   </w:style>
-  <w:style w:type="character" w:customStyle="1" w:styleId="Cmsor2Char">
-    <w:name w:val="Címsor 2 Char"/>
-    <w:basedOn w:val="Bekezdsalapbettpusa"/>
-    <w:link w:val="Cmsor2"/>
+  <w:style w:type="character" w:customStyle="1" w:styleId="Heading2Char">
+    <w:name w:val="Heading 2 Char"/>
+    <w:basedOn w:val="DefaultParagraphFont"/>
+    <w:link w:val="Heading2"/>
     <w:uiPriority w:val="9"/>
     <w:semiHidden/>
     <w:rsid w:val="00157665"/>
@@ -1815,10 +3058,10 @@
       <w:szCs w:val="32"/>
     </w:rPr>
   </w:style>
-  <w:style w:type="character" w:customStyle="1" w:styleId="Cmsor3Char">
-    <w:name w:val="Címsor 3 Char"/>
-    <w:basedOn w:val="Bekezdsalapbettpusa"/>
-    <w:link w:val="Cmsor3"/>
+  <w:style w:type="character" w:customStyle="1" w:styleId="Heading3Char">
+    <w:name w:val="Heading 3 Char"/>
+    <w:basedOn w:val="DefaultParagraphFont"/>
+    <w:link w:val="Heading3"/>
     <w:uiPriority w:val="9"/>
     <w:semiHidden/>
     <w:rsid w:val="00157665"/>
@@ -1829,10 +3072,10 @@
       <w:szCs w:val="28"/>
     </w:rPr>
   </w:style>
-  <w:style w:type="character" w:customStyle="1" w:styleId="Cmsor4Char">
-    <w:name w:val="Címsor 4 Char"/>
-    <w:basedOn w:val="Bekezdsalapbettpusa"/>
-    <w:link w:val="Cmsor4"/>
+  <w:style w:type="character" w:customStyle="1" w:styleId="Heading4Char">
+    <w:name w:val="Heading 4 Char"/>
+    <w:basedOn w:val="DefaultParagraphFont"/>
+    <w:link w:val="Heading4"/>
     <w:uiPriority w:val="9"/>
     <w:semiHidden/>
     <w:rsid w:val="00157665"/>
@@ -1843,10 +3086,10 @@
       <w:color w:val="0F4761" w:themeColor="accent1" w:themeShade="BF"/>
     </w:rPr>
   </w:style>
-  <w:style w:type="character" w:customStyle="1" w:styleId="Cmsor5Char">
-    <w:name w:val="Címsor 5 Char"/>
-    <w:basedOn w:val="Bekezdsalapbettpusa"/>
-    <w:link w:val="Cmsor5"/>
+  <w:style w:type="character" w:customStyle="1" w:styleId="Heading5Char">
+    <w:name w:val="Heading 5 Char"/>
+    <w:basedOn w:val="DefaultParagraphFont"/>
+    <w:link w:val="Heading5"/>
     <w:uiPriority w:val="9"/>
     <w:semiHidden/>
     <w:rsid w:val="00157665"/>
@@ -1855,10 +3098,10 @@
       <w:color w:val="0F4761" w:themeColor="accent1" w:themeShade="BF"/>
     </w:rPr>
   </w:style>
-  <w:style w:type="character" w:customStyle="1" w:styleId="Cmsor6Char">
-    <w:name w:val="Címsor 6 Char"/>
-    <w:basedOn w:val="Bekezdsalapbettpusa"/>
-    <w:link w:val="Cmsor6"/>
+  <w:style w:type="character" w:customStyle="1" w:styleId="Heading6Char">
+    <w:name w:val="Heading 6 Char"/>
+    <w:basedOn w:val="DefaultParagraphFont"/>
+    <w:link w:val="Heading6"/>
     <w:uiPriority w:val="9"/>
     <w:semiHidden/>
     <w:rsid w:val="00157665"/>
@@ -1869,10 +3112,10 @@
       <w:color w:val="595959" w:themeColor="text1" w:themeTint="A6"/>
     </w:rPr>
   </w:style>
-  <w:style w:type="character" w:customStyle="1" w:styleId="Cmsor7Char">
-    <w:name w:val="Címsor 7 Char"/>
-    <w:basedOn w:val="Bekezdsalapbettpusa"/>
-    <w:link w:val="Cmsor7"/>
+  <w:style w:type="character" w:customStyle="1" w:styleId="Heading7Char">
+    <w:name w:val="Heading 7 Char"/>
+    <w:basedOn w:val="DefaultParagraphFont"/>
+    <w:link w:val="Heading7"/>
     <w:uiPriority w:val="9"/>
     <w:semiHidden/>
     <w:rsid w:val="00157665"/>
@@ -1881,10 +3124,10 @@
       <w:color w:val="595959" w:themeColor="text1" w:themeTint="A6"/>
     </w:rPr>
   </w:style>
-  <w:style w:type="character" w:customStyle="1" w:styleId="Cmsor8Char">
-    <w:name w:val="Címsor 8 Char"/>
-    <w:basedOn w:val="Bekezdsalapbettpusa"/>
-    <w:link w:val="Cmsor8"/>
+  <w:style w:type="character" w:customStyle="1" w:styleId="Heading8Char">
+    <w:name w:val="Heading 8 Char"/>
+    <w:basedOn w:val="DefaultParagraphFont"/>
+    <w:link w:val="Heading8"/>
     <w:uiPriority w:val="9"/>
     <w:semiHidden/>
     <w:rsid w:val="00157665"/>
@@ -1895,10 +3138,10 @@
       <w:color w:val="272727" w:themeColor="text1" w:themeTint="D8"/>
     </w:rPr>
   </w:style>
-  <w:style w:type="character" w:customStyle="1" w:styleId="Cmsor9Char">
-    <w:name w:val="Címsor 9 Char"/>
-    <w:basedOn w:val="Bekezdsalapbettpusa"/>
-    <w:link w:val="Cmsor9"/>
+  <w:style w:type="character" w:customStyle="1" w:styleId="Heading9Char">
+    <w:name w:val="Heading 9 Char"/>
+    <w:basedOn w:val="DefaultParagraphFont"/>
+    <w:link w:val="Heading9"/>
     <w:uiPriority w:val="9"/>
     <w:semiHidden/>
     <w:rsid w:val="00157665"/>
@@ -1907,11 +3150,11 @@
       <w:color w:val="272727" w:themeColor="text1" w:themeTint="D8"/>
     </w:rPr>
   </w:style>
-  <w:style w:type="paragraph" w:styleId="Cm">
+  <w:style w:type="paragraph" w:styleId="Title">
     <w:name w:val="Title"/>
-    <w:basedOn w:val="Norml"/>
-    <w:next w:val="Norml"/>
-    <w:link w:val="CmChar"/>
+    <w:basedOn w:val="Normal"/>
+    <w:next w:val="Normal"/>
+    <w:link w:val="TitleChar"/>
     <w:uiPriority w:val="10"/>
     <w:qFormat/>
     <w:rsid w:val="00157665"/>
@@ -1927,10 +3170,10 @@
       <w:szCs w:val="56"/>
     </w:rPr>
   </w:style>
-  <w:style w:type="character" w:customStyle="1" w:styleId="CmChar">
-    <w:name w:val="Cím Char"/>
-    <w:basedOn w:val="Bekezdsalapbettpusa"/>
-    <w:link w:val="Cm"/>
+  <w:style w:type="character" w:customStyle="1" w:styleId="TitleChar">
+    <w:name w:val="Title Char"/>
+    <w:basedOn w:val="DefaultParagraphFont"/>
+    <w:link w:val="Title"/>
     <w:uiPriority w:val="10"/>
     <w:rsid w:val="00157665"/>
     <w:rPr>
@@ -1941,11 +3184,11 @@
       <w:szCs w:val="56"/>
     </w:rPr>
   </w:style>
-  <w:style w:type="paragraph" w:styleId="Alcm">
+  <w:style w:type="paragraph" w:styleId="Subtitle">
     <w:name w:val="Subtitle"/>
-    <w:basedOn w:val="Norml"/>
-    <w:next w:val="Norml"/>
-    <w:link w:val="AlcmChar"/>
+    <w:basedOn w:val="Normal"/>
+    <w:next w:val="Normal"/>
+    <w:link w:val="SubtitleChar"/>
     <w:uiPriority w:val="11"/>
     <w:qFormat/>
     <w:rsid w:val="00157665"/>
@@ -1963,10 +3206,10 @@
       <w:szCs w:val="28"/>
     </w:rPr>
   </w:style>
-  <w:style w:type="character" w:customStyle="1" w:styleId="AlcmChar">
-    <w:name w:val="Alcím Char"/>
-    <w:basedOn w:val="Bekezdsalapbettpusa"/>
-    <w:link w:val="Alcm"/>
+  <w:style w:type="character" w:customStyle="1" w:styleId="SubtitleChar">
+    <w:name w:val="Subtitle Char"/>
+    <w:basedOn w:val="DefaultParagraphFont"/>
+    <w:link w:val="Subtitle"/>
     <w:uiPriority w:val="11"/>
     <w:rsid w:val="00157665"/>
     <w:rPr>
@@ -1977,11 +3220,11 @@
       <w:szCs w:val="28"/>
     </w:rPr>
   </w:style>
-  <w:style w:type="paragraph" w:styleId="Idzet">
+  <w:style w:type="paragraph" w:styleId="Quote">
     <w:name w:val="Quote"/>
-    <w:basedOn w:val="Norml"/>
-    <w:next w:val="Norml"/>
-    <w:link w:val="IdzetChar"/>
+    <w:basedOn w:val="Normal"/>
+    <w:next w:val="Normal"/>
+    <w:link w:val="QuoteChar"/>
     <w:uiPriority w:val="29"/>
     <w:qFormat/>
     <w:rsid w:val="00157665"/>
@@ -1995,10 +3238,10 @@
       <w:color w:val="404040" w:themeColor="text1" w:themeTint="BF"/>
     </w:rPr>
   </w:style>
-  <w:style w:type="character" w:customStyle="1" w:styleId="IdzetChar">
-    <w:name w:val="Idézet Char"/>
-    <w:basedOn w:val="Bekezdsalapbettpusa"/>
-    <w:link w:val="Idzet"/>
+  <w:style w:type="character" w:customStyle="1" w:styleId="QuoteChar">
+    <w:name w:val="Quote Char"/>
+    <w:basedOn w:val="DefaultParagraphFont"/>
+    <w:link w:val="Quote"/>
     <w:uiPriority w:val="29"/>
     <w:rsid w:val="00157665"/>
     <w:rPr>
@@ -2007,9 +3250,9 @@
       <w:color w:val="404040" w:themeColor="text1" w:themeTint="BF"/>
     </w:rPr>
   </w:style>
-  <w:style w:type="paragraph" w:styleId="Listaszerbekezds">
+  <w:style w:type="paragraph" w:styleId="ListParagraph">
     <w:name w:val="List Paragraph"/>
-    <w:basedOn w:val="Norml"/>
+    <w:basedOn w:val="Normal"/>
     <w:uiPriority w:val="34"/>
     <w:qFormat/>
     <w:rsid w:val="00157665"/>
@@ -2018,9 +3261,9 @@
       <w:contextualSpacing/>
     </w:pPr>
   </w:style>
-  <w:style w:type="character" w:styleId="Erskiemels">
+  <w:style w:type="character" w:styleId="IntenseEmphasis">
     <w:name w:val="Intense Emphasis"/>
-    <w:basedOn w:val="Bekezdsalapbettpusa"/>
+    <w:basedOn w:val="DefaultParagraphFont"/>
     <w:uiPriority w:val="21"/>
     <w:qFormat/>
     <w:rsid w:val="00157665"/>
@@ -2030,11 +3273,11 @@
       <w:color w:val="0F4761" w:themeColor="accent1" w:themeShade="BF"/>
     </w:rPr>
   </w:style>
-  <w:style w:type="paragraph" w:styleId="Kiemeltidzet">
+  <w:style w:type="paragraph" w:styleId="IntenseQuote">
     <w:name w:val="Intense Quote"/>
-    <w:basedOn w:val="Norml"/>
-    <w:next w:val="Norml"/>
-    <w:link w:val="KiemeltidzetChar"/>
+    <w:basedOn w:val="Normal"/>
+    <w:next w:val="Normal"/>
+    <w:link w:val="IntenseQuoteChar"/>
     <w:uiPriority w:val="30"/>
     <w:qFormat/>
     <w:rsid w:val="00157665"/>
@@ -2053,10 +3296,10 @@
       <w:color w:val="0F4761" w:themeColor="accent1" w:themeShade="BF"/>
     </w:rPr>
   </w:style>
-  <w:style w:type="character" w:customStyle="1" w:styleId="KiemeltidzetChar">
-    <w:name w:val="Kiemelt idézet Char"/>
-    <w:basedOn w:val="Bekezdsalapbettpusa"/>
-    <w:link w:val="Kiemeltidzet"/>
+  <w:style w:type="character" w:customStyle="1" w:styleId="IntenseQuoteChar">
+    <w:name w:val="Intense Quote Char"/>
+    <w:basedOn w:val="DefaultParagraphFont"/>
+    <w:link w:val="IntenseQuote"/>
     <w:uiPriority w:val="30"/>
     <w:rsid w:val="00157665"/>
     <w:rPr>
@@ -2065,9 +3308,9 @@
       <w:color w:val="0F4761" w:themeColor="accent1" w:themeShade="BF"/>
     </w:rPr>
   </w:style>
-  <w:style w:type="character" w:styleId="Ershivatkozs">
+  <w:style w:type="character" w:styleId="IntenseReference">
     <w:name w:val="Intense Reference"/>
-    <w:basedOn w:val="Bekezdsalapbettpusa"/>
+    <w:basedOn w:val="DefaultParagraphFont"/>
     <w:uiPriority w:val="32"/>
     <w:qFormat/>
     <w:rsid w:val="00157665"/>
@@ -2081,7 +3324,7 @@
   </w:style>
   <w:style w:type="paragraph" w:customStyle="1" w:styleId="p1">
     <w:name w:val="p1"/>
-    <w:basedOn w:val="Norml"/>
+    <w:basedOn w:val="Normal"/>
     <w:rsid w:val="00157665"/>
     <w:rPr>
       <w:rFonts w:ascii="Helvetica" w:eastAsia="Times New Roman" w:hAnsi="Helvetica" w:cs="Times New Roman"/>
@@ -2095,7 +3338,7 @@
   </w:style>
   <w:style w:type="paragraph" w:customStyle="1" w:styleId="p2">
     <w:name w:val="p2"/>
-    <w:basedOn w:val="Norml"/>
+    <w:basedOn w:val="Normal"/>
     <w:rsid w:val="00157665"/>
     <w:rPr>
       <w:rFonts w:ascii="Helvetica" w:eastAsia="Times New Roman" w:hAnsi="Helvetica" w:cs="Times New Roman"/>
@@ -2109,7 +3352,7 @@
   </w:style>
   <w:style w:type="paragraph" w:customStyle="1" w:styleId="p3">
     <w:name w:val="p3"/>
-    <w:basedOn w:val="Norml"/>
+    <w:basedOn w:val="Normal"/>
     <w:rsid w:val="00157665"/>
     <w:rPr>
       <w:rFonts w:ascii="Helvetica" w:eastAsia="Times New Roman" w:hAnsi="Helvetica" w:cs="Times New Roman"/>
@@ -2123,7 +3366,7 @@
   </w:style>
   <w:style w:type="paragraph" w:customStyle="1" w:styleId="p4">
     <w:name w:val="p4"/>
-    <w:basedOn w:val="Norml"/>
+    <w:basedOn w:val="Normal"/>
     <w:rsid w:val="00157665"/>
     <w:rPr>
       <w:rFonts w:ascii="Helvetica" w:eastAsia="Times New Roman" w:hAnsi="Helvetica" w:cs="Times New Roman"/>
@@ -2137,7 +3380,7 @@
   </w:style>
   <w:style w:type="paragraph" w:customStyle="1" w:styleId="p5">
     <w:name w:val="p5"/>
-    <w:basedOn w:val="Norml"/>
+    <w:basedOn w:val="Normal"/>
     <w:rsid w:val="00157665"/>
     <w:rPr>
       <w:rFonts w:ascii="Helvetica" w:eastAsia="Times New Roman" w:hAnsi="Helvetica" w:cs="Times New Roman"/>
@@ -2151,7 +3394,7 @@
   </w:style>
   <w:style w:type="character" w:customStyle="1" w:styleId="s1">
     <w:name w:val="s1"/>
-    <w:basedOn w:val="Bekezdsalapbettpusa"/>
+    <w:basedOn w:val="DefaultParagraphFont"/>
     <w:rsid w:val="00157665"/>
     <w:rPr>
       <w:rFonts w:ascii="Helvetica" w:hAnsi="Helvetica" w:hint="default"/>
@@ -2161,12 +3404,47 @@
   </w:style>
   <w:style w:type="character" w:customStyle="1" w:styleId="s2">
     <w:name w:val="s2"/>
-    <w:basedOn w:val="Bekezdsalapbettpusa"/>
+    <w:basedOn w:val="DefaultParagraphFont"/>
     <w:rsid w:val="00157665"/>
     <w:rPr>
       <w:rFonts w:ascii="Helvetica" w:hAnsi="Helvetica" w:hint="default"/>
       <w:sz w:val="15"/>
       <w:szCs w:val="15"/>
+    </w:rPr>
+  </w:style>
+  <w:style w:type="character" w:styleId="Hyperlink">
+    <w:name w:val="Hyperlink"/>
+    <w:basedOn w:val="DefaultParagraphFont"/>
+    <w:uiPriority w:val="99"/>
+    <w:unhideWhenUsed/>
+    <w:rsid w:val="00346EB0"/>
+    <w:rPr>
+      <w:color w:val="467886" w:themeColor="hyperlink"/>
+      <w:u w:val="single"/>
+    </w:rPr>
+  </w:style>
+  <w:style w:type="character" w:styleId="UnresolvedMention">
+    <w:name w:val="Unresolved Mention"/>
+    <w:basedOn w:val="DefaultParagraphFont"/>
+    <w:uiPriority w:val="99"/>
+    <w:semiHidden/>
+    <w:unhideWhenUsed/>
+    <w:rsid w:val="00346EB0"/>
+    <w:rPr>
+      <w:color w:val="605E5C"/>
+      <w:shd w:val="clear" w:color="auto" w:fill="E1DFDD"/>
+    </w:rPr>
+  </w:style>
+  <w:style w:type="character" w:styleId="FollowedHyperlink">
+    <w:name w:val="FollowedHyperlink"/>
+    <w:basedOn w:val="DefaultParagraphFont"/>
+    <w:uiPriority w:val="99"/>
+    <w:semiHidden/>
+    <w:unhideWhenUsed/>
+    <w:rsid w:val="00346EB0"/>
+    <w:rPr>
+      <w:color w:val="96607D" w:themeColor="followedHyperlink"/>
+      <w:u w:val="single"/>
     </w:rPr>
   </w:style>
 </w:styles>

</xml_diff>